<commit_message>
Regenerate CV with hi@fakrul.dev and fakrul.dev
</commit_message>
<xml_diff>
--- a/cv/CV_Fakhrul_Mukhlisin_2026.docx
+++ b/cv/CV_Fakhrul_Mukhlisin_2026.docx
@@ -44,7 +44,7 @@
           <w:sz w:val="17"/>
           <w:szCs w:val="17"/>
         </w:rPr>
-        <w:t xml:space="preserve">fahrulmukhlisin13@gmail.com  -  +62 813 1532 4195  -  Jakarta, Indonesia</w:t>
+        <w:t xml:space="preserve">hi@fakrul.dev  -  +62 813 1532 4195  -  Jakarta, Indonesia</w:t>
       </w:r>
     </w:p>
     <w:p>
@@ -52,7 +52,7 @@
         <w:spacing w:after="40"/>
         <w:jc w:val="center"/>
       </w:pPr>
-      <w:hyperlink w:history="1" r:id="rIdghtsbg5epcvg8zthqdf7x">
+      <w:hyperlink w:history="1" r:id="rId7vw929a49ajxcqvkjs84n">
         <w:r>
           <w:rPr>
             <w:rStyle w:val="Hyperlink"/>
@@ -72,7 +72,7 @@
         </w:rPr>
         <w:t xml:space="preserve">  -  </w:t>
       </w:r>
-      <w:hyperlink w:history="1" r:id="rIdwuroz1qyojwfjsgdoxwth">
+      <w:hyperlink w:history="1" r:id="rIdvljlpnipx3akz8s4ngpej">
         <w:r>
           <w:rPr>
             <w:rStyle w:val="Hyperlink"/>
@@ -92,7 +92,7 @@
         </w:rPr>
         <w:t xml:space="preserve">  -  </w:t>
       </w:r>
-      <w:hyperlink w:history="1" r:id="rIdjqlcjrgqdlx57jkt-9jfb">
+      <w:hyperlink w:history="1" r:id="rIdmfes-jr44xim7dhdbefda">
         <w:r>
           <w:rPr>
             <w:rStyle w:val="Hyperlink"/>
@@ -100,7 +100,7 @@
             <w:sz w:val="16"/>
             <w:szCs w:val="16"/>
           </w:rPr>
-          <w:t xml:space="preserve">fakrul.netlify.app</w:t>
+          <w:t xml:space="preserve">fakrul.dev</w:t>
         </w:r>
       </w:hyperlink>
     </w:p>
@@ -610,7 +610,7 @@
         </w:rPr>
         <w:t xml:space="preserve">Implemented JWT auth, RBAC, multi-image upload, pagination, price-range filtering, and atomic DB transactions. Score: 90.91/100 (Excellent). </w:t>
       </w:r>
-      <w:hyperlink w:history="1" r:id="rIdshssuos82i9xjpmp0tsqt">
+      <w:hyperlink w:history="1" r:id="rIdv8ww3fh7ltx_ucpbdcee8">
         <w:r>
           <w:rPr>
             <w:rStyle w:val="Hyperlink"/>
@@ -701,7 +701,7 @@
         </w:rPr>
         <w:t xml:space="preserve">Delivered a pixel-perfect Figma implementation and deployed via CI/CD. Score: 87.79/100 (Excellent). </w:t>
       </w:r>
-      <w:hyperlink w:history="1" r:id="rIdiwd0jhlmw8ol-80j0rnox">
+      <w:hyperlink w:history="1" r:id="rIdulg0gam-umug1jbvomw9i">
         <w:r>
           <w:rPr>
             <w:rStyle w:val="Hyperlink"/>
@@ -792,7 +792,7 @@
         </w:rPr>
         <w:t xml:space="preserve">Built a digital archive for 1,000+ files and data visualizations for faculty presentations. Predikat: Sangat Baik. </w:t>
       </w:r>
-      <w:hyperlink w:history="1" r:id="rIdq28hcpcnmnrsmfynvfsbe">
+      <w:hyperlink w:history="1" r:id="rId4eouilmchoezc9m7ss1za">
         <w:r>
           <w:rPr>
             <w:rStyle w:val="Hyperlink"/>
@@ -879,7 +879,7 @@
         </w:rPr>
         <w:t xml:space="preserve">Published: "Penerapan Metode SAW Penerima BLT Berbasis Web pada Kantor Desa Waru Jaya" - </w:t>
       </w:r>
-      <w:hyperlink w:history="1" r:id="rIdlsbqawzy1rtguxzeflrn8">
+      <w:hyperlink w:history="1" r:id="rIdxhdq9mu93jhzwydlda_qr">
         <w:r>
           <w:rPr>
             <w:rStyle w:val="Hyperlink"/>
@@ -921,7 +921,7 @@
         </w:numPr>
         <w:spacing w:after="6"/>
       </w:pPr>
-      <w:hyperlink w:history="1" r:id="rIdsekdonh8snh9u8odxoukm">
+      <w:hyperlink w:history="1" r:id="rIdttpiqayal5ss3efzfbu4v">
         <w:r>
           <w:rPr>
             <w:rStyle w:val="Hyperlink"/>
@@ -950,7 +950,7 @@
         </w:numPr>
         <w:spacing w:after="6"/>
       </w:pPr>
-      <w:hyperlink w:history="1" r:id="rIdpc4bd6vqid728ws2vl2y0">
+      <w:hyperlink w:history="1" r:id="rIde_zaa-kht960ya37d85ed">
         <w:r>
           <w:rPr>
             <w:rStyle w:val="Hyperlink"/>
@@ -979,7 +979,7 @@
         </w:numPr>
         <w:spacing w:after="6"/>
       </w:pPr>
-      <w:hyperlink w:history="1" r:id="rIdsi_ynzwhr5dnhh2xfmvh1">
+      <w:hyperlink w:history="1" r:id="rIdy7hsoxu5nzmfbfywxltmr">
         <w:r>
           <w:rPr>
             <w:rStyle w:val="Hyperlink"/>
@@ -1008,7 +1008,7 @@
         </w:numPr>
         <w:spacing w:after="6"/>
       </w:pPr>
-      <w:hyperlink w:history="1" r:id="rIdwvjbi9llyeqsque1awdab">
+      <w:hyperlink w:history="1" r:id="rIdumd3viz4j5lo1acbjnhae">
         <w:r>
           <w:rPr>
             <w:rStyle w:val="Hyperlink"/>
@@ -1037,7 +1037,7 @@
         </w:numPr>
         <w:spacing w:after="6"/>
       </w:pPr>
-      <w:hyperlink w:history="1" r:id="rIdfv1jnyfjd0nuv3yrs9iwj">
+      <w:hyperlink w:history="1" r:id="rId6zrlu2hpaf4aulntjghmb">
         <w:r>
           <w:rPr>
             <w:rStyle w:val="Hyperlink"/>
@@ -1066,7 +1066,7 @@
         </w:numPr>
         <w:spacing w:after="6"/>
       </w:pPr>
-      <w:hyperlink w:history="1" r:id="rIdy4yaejfcb_cclir_zyf0n">
+      <w:hyperlink w:history="1" r:id="rIdioe90ursltaxgdyo3i-f7">
         <w:r>
           <w:rPr>
             <w:rStyle w:val="Hyperlink"/>

</xml_diff>

<commit_message>
CV: ringkasan ala recruiter, ENSA, proyek JBTB/Re:Daily/Notes, NobiPlay; tetap 1 halaman
</commit_message>
<xml_diff>
--- a/cv/CV_Fakhrul_Mukhlisin_2026.docx
+++ b/cv/CV_Fakhrul_Mukhlisin_2026.docx
@@ -30,7 +30,7 @@
           <w:sz w:val="21"/>
           <w:szCs w:val="21"/>
         </w:rPr>
-        <w:t xml:space="preserve">Full Stack Developer  |  Software Engineer</w:t>
+        <w:t xml:space="preserve">Full Stack Developer  |  Software Engineer  |  Available now</w:t>
       </w:r>
     </w:p>
     <w:p>
@@ -52,7 +52,7 @@
         <w:spacing w:after="40"/>
         <w:jc w:val="center"/>
       </w:pPr>
-      <w:hyperlink w:history="1" r:id="rId7vw929a49ajxcqvkjs84n">
+      <w:hyperlink w:history="1" r:id="rId3tcwx8hvropgkt8tjftst">
         <w:r>
           <w:rPr>
             <w:rStyle w:val="Hyperlink"/>
@@ -72,7 +72,7 @@
         </w:rPr>
         <w:t xml:space="preserve">  -  </w:t>
       </w:r>
-      <w:hyperlink w:history="1" r:id="rIdvljlpnipx3akz8s4ngpej">
+      <w:hyperlink w:history="1" r:id="rId4bvlwjh5xsmpuphk8tonz">
         <w:r>
           <w:rPr>
             <w:rStyle w:val="Hyperlink"/>
@@ -92,7 +92,7 @@
         </w:rPr>
         <w:t xml:space="preserve">  -  </w:t>
       </w:r>
-      <w:hyperlink w:history="1" r:id="rIdmfes-jr44xim7dhdbefda">
+      <w:hyperlink w:history="1" r:id="rIdo8w1kpscqzxolcidb7sho">
         <w:r>
           <w:rPr>
             <w:rStyle w:val="Hyperlink"/>
@@ -109,7 +109,7 @@
         <w:pBdr>
           <w:bottom w:val="single" w:color="1F4E79" w:sz="6" w:space="2"/>
         </w:pBdr>
-        <w:spacing w:after="18" w:before="44"/>
+        <w:spacing w:after="14" w:before="36"/>
       </w:pPr>
       <w:r>
         <w:rPr>
@@ -133,7 +133,7 @@
           <w:sz w:val="17"/>
           <w:szCs w:val="17"/>
         </w:rPr>
-        <w:t xml:space="preserve">Information Systems student at UNPAM, Semester 7 (GPA 3.70/4.0, Semester 1-6) building production web applications end to end. Currently a Data Analyst (OJT) at APIKpreneur, Bakti Pemuda Foundation, and a Full Stack Engineer at PT Indotech Digital, where 20+ pull requests have been merged to a live Laravel platform. Previously built a marketplace REST API in Golang (90.91/100) and an e-commerce catalog in Vue.js (87.79/100), and placed 5th of 926 in a Yandex machine-learning competition.</w:t>
+        <w:t xml:space="preserve">Full Stack Developer who replaces manual, error-prone workflows with systems people actually use. Information Systems student at UNPAM (GPA 3.70/4.0, Semester 1-6) and Full Stack Engineer at PT Indotech Digital, with 20+ pull requests merged to a live Laravel platform; also a Data Analyst (OJT) at APIKpreneur, Bakti Pemuda Foundation. Final year project: a Laravel system replacing a casting agency's WhatsApp-and-spreadsheet workflow. Earlier: a Golang marketplace API (90.91/100) and a Vue.js e-commerce catalog (87.79/100).</w:t>
       </w:r>
     </w:p>
     <w:p>
@@ -141,7 +141,7 @@
         <w:pBdr>
           <w:bottom w:val="single" w:color="1F4E79" w:sz="6" w:space="2"/>
         </w:pBdr>
-        <w:spacing w:after="18" w:before="44"/>
+        <w:spacing w:after="14" w:before="36"/>
       </w:pPr>
       <w:r>
         <w:rPr>
@@ -167,15 +167,15 @@
           <w:sz w:val="17"/>
           <w:szCs w:val="17"/>
         </w:rPr>
-        <w:t xml:space="preserve">Languages:  </w:t>
-      </w:r>
-      <w:r>
-        <w:rPr>
-          <w:rFonts w:ascii="Arial" w:cs="Arial" w:eastAsia="Arial" w:hAnsi="Arial"/>
-          <w:sz w:val="17"/>
-          <w:szCs w:val="17"/>
-        </w:rPr>
-        <w:t xml:space="preserve">PHP, JavaScript, Golang, SQL, HTML5, CSS3</w:t>
+        <w:t xml:space="preserve">Languages &amp; Data:  </w:t>
+      </w:r>
+      <w:r>
+        <w:rPr>
+          <w:rFonts w:ascii="Arial" w:cs="Arial" w:eastAsia="Arial" w:hAnsi="Arial"/>
+          <w:sz w:val="17"/>
+          <w:szCs w:val="17"/>
+        </w:rPr>
+        <w:t xml:space="preserve">PHP, JavaScript, Golang, SQL, MySQL, HTML5, CSS3</w:t>
       </w:r>
     </w:p>
     <w:p>
@@ -213,15 +213,15 @@
           <w:sz w:val="17"/>
           <w:szCs w:val="17"/>
         </w:rPr>
-        <w:t xml:space="preserve">Databases:  </w:t>
-      </w:r>
-      <w:r>
-        <w:rPr>
-          <w:rFonts w:ascii="Arial" w:cs="Arial" w:eastAsia="Arial" w:hAnsi="Arial"/>
-          <w:sz w:val="17"/>
-          <w:szCs w:val="17"/>
-        </w:rPr>
-        <w:t xml:space="preserve">MySQL</w:t>
+        <w:t xml:space="preserve">Architecture &amp; Auth:  </w:t>
+      </w:r>
+      <w:r>
+        <w:rPr>
+          <w:rFonts w:ascii="Arial" w:cs="Arial" w:eastAsia="Arial" w:hAnsi="Arial"/>
+          <w:sz w:val="17"/>
+          <w:szCs w:val="17"/>
+        </w:rPr>
+        <w:t xml:space="preserve">Clean Architecture (Handler-Service-Repository), Eloquent ORM, REST API, JWT, RBAC</w:t>
       </w:r>
     </w:p>
     <w:p>
@@ -236,15 +236,15 @@
           <w:sz w:val="17"/>
           <w:szCs w:val="17"/>
         </w:rPr>
-        <w:t xml:space="preserve">Architecture &amp; Auth:  </w:t>
-      </w:r>
-      <w:r>
-        <w:rPr>
-          <w:rFonts w:ascii="Arial" w:cs="Arial" w:eastAsia="Arial" w:hAnsi="Arial"/>
-          <w:sz w:val="17"/>
-          <w:szCs w:val="17"/>
-        </w:rPr>
-        <w:t xml:space="preserve">Clean Architecture (Handler-Service-Repository), Eloquent ORM, REST API, JWT, RBAC</w:t>
+        <w:t xml:space="preserve">Data &amp; Automation:  </w:t>
+      </w:r>
+      <w:r>
+        <w:rPr>
+          <w:rFonts w:ascii="Arial" w:cs="Arial" w:eastAsia="Arial" w:hAnsi="Arial"/>
+          <w:sz w:val="17"/>
+          <w:szCs w:val="17"/>
+        </w:rPr>
+        <w:t xml:space="preserve">Google Apps Script, Data Analysis, Dashboard Reporting</w:t>
       </w:r>
     </w:p>
     <w:p>
@@ -259,15 +259,15 @@
           <w:sz w:val="17"/>
           <w:szCs w:val="17"/>
         </w:rPr>
-        <w:t xml:space="preserve">Data &amp; Automation:  </w:t>
-      </w:r>
-      <w:r>
-        <w:rPr>
-          <w:rFonts w:ascii="Arial" w:cs="Arial" w:eastAsia="Arial" w:hAnsi="Arial"/>
-          <w:sz w:val="17"/>
-          <w:szCs w:val="17"/>
-        </w:rPr>
-        <w:t xml:space="preserve">Google Apps Script, Data Analysis, Dashboard Reporting</w:t>
+        <w:t xml:space="preserve">Tools &amp; DevOps:  </w:t>
+      </w:r>
+      <w:r>
+        <w:rPr>
+          <w:rFonts w:ascii="Arial" w:cs="Arial" w:eastAsia="Arial" w:hAnsi="Arial"/>
+          <w:sz w:val="17"/>
+          <w:szCs w:val="17"/>
+        </w:rPr>
+        <w:t xml:space="preserve">Git &amp; PR review, GitHub, GitHub Actions, GitLab CI/CD, Postman, WSL, Figma</w:t>
       </w:r>
     </w:p>
     <w:p>
@@ -282,15 +282,15 @@
           <w:sz w:val="17"/>
           <w:szCs w:val="17"/>
         </w:rPr>
-        <w:t xml:space="preserve">Tools &amp; DevOps:  </w:t>
-      </w:r>
-      <w:r>
-        <w:rPr>
-          <w:rFonts w:ascii="Arial" w:cs="Arial" w:eastAsia="Arial" w:hAnsi="Arial"/>
-          <w:sz w:val="17"/>
-          <w:szCs w:val="17"/>
-        </w:rPr>
-        <w:t xml:space="preserve">Git &amp; PR review, GitHub, GitLab CI/CD, Postman, WSL, Figma</w:t>
+        <w:t xml:space="preserve">Networking:  </w:t>
+      </w:r>
+      <w:r>
+        <w:rPr>
+          <w:rFonts w:ascii="Arial" w:cs="Arial" w:eastAsia="Arial" w:hAnsi="Arial"/>
+          <w:sz w:val="17"/>
+          <w:szCs w:val="17"/>
+        </w:rPr>
+        <w:t xml:space="preserve">Cisco IOS, OSPFv2, ACLs, NAT, network security hardening (CCNA ENSA)</w:t>
       </w:r>
     </w:p>
     <w:p>
@@ -321,7 +321,7 @@
         <w:pBdr>
           <w:bottom w:val="single" w:color="1F4E79" w:sz="6" w:space="2"/>
         </w:pBdr>
-        <w:spacing w:after="18" w:before="44"/>
+        <w:spacing w:after="14" w:before="36"/>
       </w:pPr>
       <w:r>
         <w:rPr>
@@ -350,7 +350,7 @@
           <w:sz w:val="18"/>
           <w:szCs w:val="18"/>
         </w:rPr>
-        <w:t xml:space="preserve">Data Analyst (On-the-Job Training) - APIKpreneur / Bakti Pemuda Foundation</w:t>
+        <w:t xml:space="preserve">Data Analyst (OJT) - APIKpreneur / Bakti Pemuda Foundation</w:t>
       </w:r>
       <w:r>
         <w:rPr>
@@ -361,32 +361,17 @@
           <w:sz w:val="17"/>
           <w:szCs w:val="17"/>
         </w:rPr>
-        <w:t xml:space="preserve">	Aug 2026 - Present</w:t>
-      </w:r>
-    </w:p>
-    <w:p>
-      <w:pPr>
-        <w:spacing w:after="12"/>
-      </w:pPr>
-      <w:r>
-        <w:rPr>
-          <w:rFonts w:ascii="Arial" w:cs="Arial" w:eastAsia="Arial" w:hAnsi="Arial"/>
-          <w:i/>
-          <w:iCs/>
-          <w:sz w:val="16"/>
-          <w:szCs w:val="16"/>
-        </w:rPr>
-        <w:t xml:space="preserve">Jakarta, Indonesia - Hybrid</w:t>
-      </w:r>
-    </w:p>
-    <w:p>
-      <w:pPr>
-        <w:pStyle w:val="ListParagraph"/>
-        <w:numPr>
-          <w:ilvl w:val="0"/>
-          <w:numId w:val="2"/>
-        </w:numPr>
-        <w:spacing w:after="6"/>
+        <w:t xml:space="preserve">	Aug 2026 - Present  |  Jakarta, Hybrid</w:t>
+      </w:r>
+    </w:p>
+    <w:p>
+      <w:pPr>
+        <w:pStyle w:val="ListParagraph"/>
+        <w:numPr>
+          <w:ilvl w:val="0"/>
+          <w:numId w:val="2"/>
+        </w:numPr>
+        <w:spacing w:after="3"/>
       </w:pPr>
       <w:r>
         <w:rPr>
@@ -404,7 +389,7 @@
           <w:ilvl w:val="0"/>
           <w:numId w:val="2"/>
         </w:numPr>
-        <w:spacing w:after="6"/>
+        <w:spacing w:after="3"/>
       </w:pPr>
       <w:r>
         <w:rPr>
@@ -422,7 +407,7 @@
           <w:ilvl w:val="0"/>
           <w:numId w:val="2"/>
         </w:numPr>
-        <w:spacing w:after="6"/>
+        <w:spacing w:after="3"/>
       </w:pPr>
       <w:r>
         <w:rPr>
@@ -459,32 +444,17 @@
           <w:sz w:val="17"/>
           <w:szCs w:val="17"/>
         </w:rPr>
-        <w:t xml:space="preserve">	Jun 2026 - Present</w:t>
-      </w:r>
-    </w:p>
-    <w:p>
-      <w:pPr>
-        <w:spacing w:after="12"/>
-      </w:pPr>
-      <w:r>
-        <w:rPr>
-          <w:rFonts w:ascii="Arial" w:cs="Arial" w:eastAsia="Arial" w:hAnsi="Arial"/>
-          <w:i/>
-          <w:iCs/>
-          <w:sz w:val="16"/>
-          <w:szCs w:val="16"/>
-        </w:rPr>
-        <w:t xml:space="preserve">Jakarta, Indonesia - Hybrid</w:t>
-      </w:r>
-    </w:p>
-    <w:p>
-      <w:pPr>
-        <w:pStyle w:val="ListParagraph"/>
-        <w:numPr>
-          <w:ilvl w:val="0"/>
-          <w:numId w:val="2"/>
-        </w:numPr>
-        <w:spacing w:after="6"/>
+        <w:t xml:space="preserve">	Jun 2026 - Present  |  Jakarta, Hybrid</w:t>
+      </w:r>
+    </w:p>
+    <w:p>
+      <w:pPr>
+        <w:pStyle w:val="ListParagraph"/>
+        <w:numPr>
+          <w:ilvl w:val="0"/>
+          <w:numId w:val="2"/>
+        </w:numPr>
+        <w:spacing w:after="3"/>
       </w:pPr>
       <w:r>
         <w:rPr>
@@ -502,7 +472,25 @@
           <w:ilvl w:val="0"/>
           <w:numId w:val="2"/>
         </w:numPr>
-        <w:spacing w:after="6"/>
+        <w:spacing w:after="3"/>
+      </w:pPr>
+      <w:r>
+        <w:rPr>
+          <w:rFonts w:ascii="Arial" w:cs="Arial" w:eastAsia="Arial" w:hAnsi="Arial"/>
+          <w:sz w:val="17"/>
+          <w:szCs w:val="17"/>
+        </w:rPr>
+        <w:t xml:space="preserve">Building the live-streaming studio module for NobiPlay: role-based CMS, stream scheduling, and automated channel setup, backed by a 442-test suite.</w:t>
+      </w:r>
+    </w:p>
+    <w:p>
+      <w:pPr>
+        <w:pStyle w:val="ListParagraph"/>
+        <w:numPr>
+          <w:ilvl w:val="0"/>
+          <w:numId w:val="2"/>
+        </w:numPr>
+        <w:spacing w:after="3"/>
       </w:pPr>
       <w:r>
         <w:rPr>
@@ -520,15 +508,15 @@
           <w:ilvl w:val="0"/>
           <w:numId w:val="2"/>
         </w:numPr>
-        <w:spacing w:after="6"/>
-      </w:pPr>
-      <w:r>
-        <w:rPr>
-          <w:rFonts w:ascii="Arial" w:cs="Arial" w:eastAsia="Arial" w:hAnsi="Arial"/>
-          <w:sz w:val="17"/>
-          <w:szCs w:val="17"/>
-        </w:rPr>
-        <w:t xml:space="preserve">Diagnosed a production defect to root cause - a corrupted vendor asset silently halted JavaScript execution - and hardened the page so one failing library cannot break unrelated features.</w:t>
+        <w:spacing w:after="3"/>
+      </w:pPr>
+      <w:r>
+        <w:rPr>
+          <w:rFonts w:ascii="Arial" w:cs="Arial" w:eastAsia="Arial" w:hAnsi="Arial"/>
+          <w:sz w:val="17"/>
+          <w:szCs w:val="17"/>
+        </w:rPr>
+        <w:t xml:space="preserve">Traced a production defect to its root cause (a corrupted vendor asset silently halting JavaScript) and hardened the page so one failing library cannot break unrelated features.</w:t>
       </w:r>
     </w:p>
     <w:p>
@@ -557,60 +545,27 @@
           <w:sz w:val="17"/>
           <w:szCs w:val="17"/>
         </w:rPr>
-        <w:t xml:space="preserve">	Dec 2025</w:t>
-      </w:r>
-    </w:p>
-    <w:p>
-      <w:pPr>
-        <w:spacing w:after="12"/>
-      </w:pPr>
-      <w:r>
-        <w:rPr>
-          <w:rFonts w:ascii="Arial" w:cs="Arial" w:eastAsia="Arial" w:hAnsi="Arial"/>
-          <w:i/>
-          <w:iCs/>
-          <w:sz w:val="16"/>
-          <w:szCs w:val="16"/>
-        </w:rPr>
-        <w:t xml:space="preserve">Remote</w:t>
-      </w:r>
-    </w:p>
-    <w:p>
-      <w:pPr>
-        <w:pStyle w:val="ListParagraph"/>
-        <w:numPr>
-          <w:ilvl w:val="0"/>
-          <w:numId w:val="2"/>
-        </w:numPr>
-        <w:spacing w:after="6"/>
-      </w:pPr>
-      <w:r>
-        <w:rPr>
-          <w:rFonts w:ascii="Arial" w:cs="Arial" w:eastAsia="Arial" w:hAnsi="Arial"/>
-          <w:sz w:val="17"/>
-          <w:szCs w:val="17"/>
-        </w:rPr>
-        <w:t xml:space="preserve">Built a Marketplace REST API (Golang/Gin, MySQL, JWT) using Clean Architecture across 7 modules: Auth, User, Store, Address, Category, Product, Transaction.</w:t>
-      </w:r>
-    </w:p>
-    <w:p>
-      <w:pPr>
-        <w:pStyle w:val="ListParagraph"/>
-        <w:numPr>
-          <w:ilvl w:val="0"/>
-          <w:numId w:val="2"/>
-        </w:numPr>
-        <w:spacing w:after="6"/>
-      </w:pPr>
-      <w:r>
-        <w:rPr>
-          <w:rFonts w:ascii="Arial" w:cs="Arial" w:eastAsia="Arial" w:hAnsi="Arial"/>
-          <w:sz w:val="17"/>
-          <w:szCs w:val="17"/>
-        </w:rPr>
-        <w:t xml:space="preserve">Implemented JWT auth, RBAC, multi-image upload, pagination, price-range filtering, and atomic DB transactions. Score: 90.91/100 (Excellent). </w:t>
-      </w:r>
-      <w:hyperlink w:history="1" r:id="rIdv8ww3fh7ltx_ucpbdcee8">
+        <w:t xml:space="preserve">	Dec 2025  |  Remote</w:t>
+      </w:r>
+    </w:p>
+    <w:p>
+      <w:pPr>
+        <w:pStyle w:val="ListParagraph"/>
+        <w:numPr>
+          <w:ilvl w:val="0"/>
+          <w:numId w:val="2"/>
+        </w:numPr>
+        <w:spacing w:after="3"/>
+      </w:pPr>
+      <w:r>
+        <w:rPr>
+          <w:rFonts w:ascii="Arial" w:cs="Arial" w:eastAsia="Arial" w:hAnsi="Arial"/>
+          <w:sz w:val="17"/>
+          <w:szCs w:val="17"/>
+        </w:rPr>
+        <w:t xml:space="preserve">Built a Marketplace REST API (Golang/Gin, MySQL, JWT) with Clean Architecture across 7 modules, including RBAC, multi-image upload, pagination, and atomic DB transactions. Score: 90.91/100. </w:t>
+      </w:r>
+      <w:hyperlink w:history="1" r:id="rIdmrj_ejjjeec2n1ecdflwy">
         <w:r>
           <w:rPr>
             <w:rStyle w:val="Hyperlink"/>
@@ -648,60 +603,27 @@
           <w:sz w:val="17"/>
           <w:szCs w:val="17"/>
         </w:rPr>
-        <w:t xml:space="preserve">	Oct - Nov 2025</w:t>
-      </w:r>
-    </w:p>
-    <w:p>
-      <w:pPr>
-        <w:spacing w:after="12"/>
-      </w:pPr>
-      <w:r>
-        <w:rPr>
-          <w:rFonts w:ascii="Arial" w:cs="Arial" w:eastAsia="Arial" w:hAnsi="Arial"/>
-          <w:i/>
-          <w:iCs/>
-          <w:sz w:val="16"/>
-          <w:szCs w:val="16"/>
-        </w:rPr>
-        <w:t xml:space="preserve">Remote</w:t>
-      </w:r>
-    </w:p>
-    <w:p>
-      <w:pPr>
-        <w:pStyle w:val="ListParagraph"/>
-        <w:numPr>
-          <w:ilvl w:val="0"/>
-          <w:numId w:val="2"/>
-        </w:numPr>
-        <w:spacing w:after="6"/>
-      </w:pPr>
-      <w:r>
-        <w:rPr>
-          <w:rFonts w:ascii="Arial" w:cs="Arial" w:eastAsia="Arial" w:hAnsi="Arial"/>
-          <w:sz w:val="17"/>
-          <w:szCs w:val="17"/>
-        </w:rPr>
-        <w:t xml:space="preserve">Built an E-Commerce Catalog (Vue.js 2) consuming live REST API data, with 3 dynamic UI themes via class binding and CSS variables.</w:t>
-      </w:r>
-    </w:p>
-    <w:p>
-      <w:pPr>
-        <w:pStyle w:val="ListParagraph"/>
-        <w:numPr>
-          <w:ilvl w:val="0"/>
-          <w:numId w:val="2"/>
-        </w:numPr>
-        <w:spacing w:after="6"/>
-      </w:pPr>
-      <w:r>
-        <w:rPr>
-          <w:rFonts w:ascii="Arial" w:cs="Arial" w:eastAsia="Arial" w:hAnsi="Arial"/>
-          <w:sz w:val="17"/>
-          <w:szCs w:val="17"/>
-        </w:rPr>
-        <w:t xml:space="preserve">Delivered a pixel-perfect Figma implementation and deployed via CI/CD. Score: 87.79/100 (Excellent). </w:t>
-      </w:r>
-      <w:hyperlink w:history="1" r:id="rIdulg0gam-umug1jbvomw9i">
+        <w:t xml:space="preserve">	Oct - Nov 2025  |  Remote</w:t>
+      </w:r>
+    </w:p>
+    <w:p>
+      <w:pPr>
+        <w:pStyle w:val="ListParagraph"/>
+        <w:numPr>
+          <w:ilvl w:val="0"/>
+          <w:numId w:val="2"/>
+        </w:numPr>
+        <w:spacing w:after="3"/>
+      </w:pPr>
+      <w:r>
+        <w:rPr>
+          <w:rFonts w:ascii="Arial" w:cs="Arial" w:eastAsia="Arial" w:hAnsi="Arial"/>
+          <w:sz w:val="17"/>
+          <w:szCs w:val="17"/>
+        </w:rPr>
+        <w:t xml:space="preserve">Built an E-Commerce Catalog (Vue.js 2) on live REST API data with 3 dynamic UI themes, a pixel-perfect Figma implementation, and CI/CD deployment. Score: 87.79/100. </w:t>
+      </w:r>
+      <w:hyperlink w:history="1" r:id="rIdepgkzbkyf5sdo4ugdkah_">
         <w:r>
           <w:rPr>
             <w:rStyle w:val="Hyperlink"/>
@@ -739,60 +661,27 @@
           <w:sz w:val="17"/>
           <w:szCs w:val="17"/>
         </w:rPr>
-        <w:t xml:space="preserve">	Nov 2024 - Jul 2025</w:t>
-      </w:r>
-    </w:p>
-    <w:p>
-      <w:pPr>
-        <w:spacing w:after="12"/>
-      </w:pPr>
-      <w:r>
-        <w:rPr>
-          <w:rFonts w:ascii="Arial" w:cs="Arial" w:eastAsia="Arial" w:hAnsi="Arial"/>
-          <w:i/>
-          <w:iCs/>
-          <w:sz w:val="16"/>
-          <w:szCs w:val="16"/>
-        </w:rPr>
-        <w:t xml:space="preserve">Tangerang Selatan - On-site</w:t>
-      </w:r>
-    </w:p>
-    <w:p>
-      <w:pPr>
-        <w:pStyle w:val="ListParagraph"/>
-        <w:numPr>
-          <w:ilvl w:val="0"/>
-          <w:numId w:val="2"/>
-        </w:numPr>
-        <w:spacing w:after="6"/>
-      </w:pPr>
-      <w:r>
-        <w:rPr>
-          <w:rFonts w:ascii="Arial" w:cs="Arial" w:eastAsia="Arial" w:hAnsi="Arial"/>
-          <w:sz w:val="17"/>
-          <w:szCs w:val="17"/>
-        </w:rPr>
-        <w:t xml:space="preserve">Structured and managed 500+ student and alumni records and automated data workflows with JavaScript.</w:t>
-      </w:r>
-    </w:p>
-    <w:p>
-      <w:pPr>
-        <w:pStyle w:val="ListParagraph"/>
-        <w:numPr>
-          <w:ilvl w:val="0"/>
-          <w:numId w:val="2"/>
-        </w:numPr>
-        <w:spacing w:after="6"/>
-      </w:pPr>
-      <w:r>
-        <w:rPr>
-          <w:rFonts w:ascii="Arial" w:cs="Arial" w:eastAsia="Arial" w:hAnsi="Arial"/>
-          <w:sz w:val="17"/>
-          <w:szCs w:val="17"/>
-        </w:rPr>
-        <w:t xml:space="preserve">Built a digital archive for 1,000+ files and data visualizations for faculty presentations. Predikat: Sangat Baik. </w:t>
-      </w:r>
-      <w:hyperlink w:history="1" r:id="rId4eouilmchoezc9m7ss1za">
+        <w:t xml:space="preserve">	Nov 2024 - Jul 2025  |  On-site</w:t>
+      </w:r>
+    </w:p>
+    <w:p>
+      <w:pPr>
+        <w:pStyle w:val="ListParagraph"/>
+        <w:numPr>
+          <w:ilvl w:val="0"/>
+          <w:numId w:val="2"/>
+        </w:numPr>
+        <w:spacing w:after="3"/>
+      </w:pPr>
+      <w:r>
+        <w:rPr>
+          <w:rFonts w:ascii="Arial" w:cs="Arial" w:eastAsia="Arial" w:hAnsi="Arial"/>
+          <w:sz w:val="17"/>
+          <w:szCs w:val="17"/>
+        </w:rPr>
+        <w:t xml:space="preserve">Managed 500+ student and alumni records, automated data workflows with JavaScript, and built a digital archive of 1,000+ files. Predikat: Sangat Baik. </w:t>
+      </w:r>
+      <w:hyperlink w:history="1" r:id="rIdn5eii5stktnct_c5f49_d">
         <w:r>
           <w:rPr>
             <w:rStyle w:val="Hyperlink"/>
@@ -809,7 +698,7 @@
         <w:pBdr>
           <w:bottom w:val="single" w:color="1F4E79" w:sz="6" w:space="2"/>
         </w:pBdr>
-        <w:spacing w:after="18" w:before="44"/>
+        <w:spacing w:after="14" w:before="36"/>
       </w:pPr>
       <w:r>
         <w:rPr>
@@ -820,7 +709,7 @@
           <w:sz w:val="20"/>
           <w:szCs w:val="20"/>
         </w:rPr>
-        <w:t xml:space="preserve">EDUCATION</w:t>
+        <w:t xml:space="preserve">SELECTED PROJECTS</w:t>
       </w:r>
     </w:p>
     <w:p>
@@ -838,7 +727,7 @@
           <w:sz w:val="18"/>
           <w:szCs w:val="18"/>
         </w:rPr>
-        <w:t xml:space="preserve">Bachelor of Information Systems - Universitas Pamulang</w:t>
+        <w:t xml:space="preserve">SIM Casting - PT JBTB Casting Creative Group (Final Year Project)</w:t>
       </w:r>
       <w:r>
         <w:rPr>
@@ -849,37 +738,188 @@
           <w:sz w:val="17"/>
           <w:szCs w:val="17"/>
         </w:rPr>
-        <w:t xml:space="preserve">	Sep 2023 - Oct 2027 (Expected)</w:t>
-      </w:r>
-    </w:p>
-    <w:p>
-      <w:pPr>
-        <w:spacing w:after="6"/>
-      </w:pPr>
-      <w:r>
-        <w:rPr>
-          <w:rFonts w:ascii="Arial" w:cs="Arial" w:eastAsia="Arial" w:hAnsi="Arial"/>
-          <w:sz w:val="17"/>
-          <w:szCs w:val="17"/>
-        </w:rPr>
-        <w:t xml:space="preserve">GPA 3.70 / 4.00 (Semester 1-6) - Tangerang Selatan, Banten</w:t>
-      </w:r>
-    </w:p>
-    <w:p>
-      <w:pPr>
-        <w:spacing w:after="12"/>
-      </w:pPr>
+        <w:t xml:space="preserve">	Sep 2026 - Present</w:t>
+      </w:r>
+    </w:p>
+    <w:p>
+      <w:pPr>
+        <w:pStyle w:val="ListParagraph"/>
+        <w:numPr>
+          <w:ilvl w:val="0"/>
+          <w:numId w:val="2"/>
+        </w:numPr>
+        <w:spacing w:after="3"/>
+      </w:pPr>
+      <w:r>
+        <w:rPr>
+          <w:rFonts w:ascii="Arial" w:cs="Arial" w:eastAsia="Arial" w:hAnsi="Arial"/>
+          <w:sz w:val="17"/>
+          <w:szCs w:val="17"/>
+        </w:rPr>
+        <w:t xml:space="preserve">Project lead and lead developer (team of 3): Laravel 13 system with five roles, logged multi-round fee negotiation, payslips, digital contracts, and 769 automated tests on SQLite and MySQL.</w:t>
+      </w:r>
+    </w:p>
+    <w:p>
+      <w:pPr>
+        <w:tabs>
+          <w:tab w:val="right" w:pos="9026"/>
+        </w:tabs>
+        <w:spacing w:after="4" w:before="32"/>
+      </w:pPr>
+      <w:r>
+        <w:rPr>
+          <w:rFonts w:ascii="Arial" w:cs="Arial" w:eastAsia="Arial" w:hAnsi="Arial"/>
+          <w:b/>
+          <w:bCs/>
+          <w:sz w:val="18"/>
+          <w:szCs w:val="18"/>
+        </w:rPr>
+        <w:t xml:space="preserve">Re:Daily Coffee website and Notes blog</w:t>
+      </w:r>
       <w:r>
         <w:rPr>
           <w:rFonts w:ascii="Arial" w:cs="Arial" w:eastAsia="Arial" w:hAnsi="Arial"/>
           <w:i/>
           <w:iCs/>
+          <w:color w:val="555555"/>
+          <w:sz w:val="17"/>
+          <w:szCs w:val="17"/>
+        </w:rPr>
+        <w:t xml:space="preserve">	Oct 2026</w:t>
+      </w:r>
+    </w:p>
+    <w:p>
+      <w:pPr>
+        <w:pStyle w:val="ListParagraph"/>
+        <w:numPr>
+          <w:ilvl w:val="0"/>
+          <w:numId w:val="2"/>
+        </w:numPr>
+        <w:spacing w:after="3"/>
+      </w:pPr>
+      <w:r>
+        <w:rPr>
+          <w:rFonts w:ascii="Arial" w:cs="Arial" w:eastAsia="Arial" w:hAnsi="Arial"/>
+          <w:sz w:val="17"/>
+          <w:szCs w:val="17"/>
+        </w:rPr>
+        <w:t xml:space="preserve">Built and deployed two live static sites on GitHub Pages with custom Node generators, covering structured data and sitemaps: </w:t>
+      </w:r>
+      <w:hyperlink w:history="1" r:id="rIdnbxltdldkbcswgscqakqb">
+        <w:r>
+          <w:rPr>
+            <w:rStyle w:val="Hyperlink"/>
+            <w:rFonts w:ascii="Arial" w:cs="Arial" w:eastAsia="Arial" w:hAnsi="Arial"/>
+            <w:sz w:val="17"/>
+            <w:szCs w:val="17"/>
+          </w:rPr>
+          <w:t xml:space="preserve">re-daily.my.id</w:t>
+        </w:r>
+      </w:hyperlink>
+      <w:r>
+        <w:rPr>
+          <w:rFonts w:ascii="Arial" w:cs="Arial" w:eastAsia="Arial" w:hAnsi="Arial"/>
+          <w:sz w:val="17"/>
+          <w:szCs w:val="17"/>
+        </w:rPr>
+        <w:t xml:space="preserve"> (café site) and </w:t>
+      </w:r>
+      <w:hyperlink w:history="1" r:id="rIdf1k6euejceowp4iw7k4k9">
+        <w:r>
+          <w:rPr>
+            <w:rStyle w:val="Hyperlink"/>
+            <w:rFonts w:ascii="Arial" w:cs="Arial" w:eastAsia="Arial" w:hAnsi="Arial"/>
+            <w:sz w:val="17"/>
+            <w:szCs w:val="17"/>
+          </w:rPr>
+          <w:t xml:space="preserve">notes.fakrul.dev</w:t>
+        </w:r>
+      </w:hyperlink>
+      <w:r>
+        <w:rPr>
+          <w:rFonts w:ascii="Arial" w:cs="Arial" w:eastAsia="Arial" w:hAnsi="Arial"/>
+          <w:sz w:val="17"/>
+          <w:szCs w:val="17"/>
+        </w:rPr>
+        <w:t xml:space="preserve"> (blog).</w:t>
+      </w:r>
+    </w:p>
+    <w:p>
+      <w:pPr>
+        <w:pBdr>
+          <w:bottom w:val="single" w:color="1F4E79" w:sz="6" w:space="2"/>
+        </w:pBdr>
+        <w:spacing w:after="14" w:before="36"/>
+      </w:pPr>
+      <w:r>
+        <w:rPr>
+          <w:rFonts w:ascii="Arial" w:cs="Arial" w:eastAsia="Arial" w:hAnsi="Arial"/>
+          <w:b/>
+          <w:bCs/>
+          <w:color w:val="1F4E79"/>
+          <w:sz w:val="20"/>
+          <w:szCs w:val="20"/>
+        </w:rPr>
+        <w:t xml:space="preserve">EDUCATION</w:t>
+      </w:r>
+    </w:p>
+    <w:p>
+      <w:pPr>
+        <w:tabs>
+          <w:tab w:val="right" w:pos="9026"/>
+        </w:tabs>
+        <w:spacing w:after="4" w:before="32"/>
+      </w:pPr>
+      <w:r>
+        <w:rPr>
+          <w:rFonts w:ascii="Arial" w:cs="Arial" w:eastAsia="Arial" w:hAnsi="Arial"/>
+          <w:b/>
+          <w:bCs/>
+          <w:sz w:val="18"/>
+          <w:szCs w:val="18"/>
+        </w:rPr>
+        <w:t xml:space="preserve">Bachelor of Information Systems - Universitas Pamulang</w:t>
+      </w:r>
+      <w:r>
+        <w:rPr>
+          <w:rFonts w:ascii="Arial" w:cs="Arial" w:eastAsia="Arial" w:hAnsi="Arial"/>
+          <w:i/>
+          <w:iCs/>
+          <w:color w:val="555555"/>
+          <w:sz w:val="17"/>
+          <w:szCs w:val="17"/>
+        </w:rPr>
+        <w:t xml:space="preserve">	Sep 2023 - Oct 2027 (Expected)</w:t>
+      </w:r>
+    </w:p>
+    <w:p>
+      <w:pPr>
+        <w:spacing w:after="6"/>
+      </w:pPr>
+      <w:r>
+        <w:rPr>
+          <w:rFonts w:ascii="Arial" w:cs="Arial" w:eastAsia="Arial" w:hAnsi="Arial"/>
+          <w:sz w:val="17"/>
+          <w:szCs w:val="17"/>
+        </w:rPr>
+        <w:t xml:space="preserve">GPA 3.70 / 4.00 (Semester 1-6) - Tangerang Selatan, Banten</w:t>
+      </w:r>
+    </w:p>
+    <w:p>
+      <w:pPr>
+        <w:spacing w:after="12"/>
+      </w:pPr>
+      <w:r>
+        <w:rPr>
+          <w:rFonts w:ascii="Arial" w:cs="Arial" w:eastAsia="Arial" w:hAnsi="Arial"/>
+          <w:i/>
+          <w:iCs/>
           <w:sz w:val="17"/>
           <w:szCs w:val="17"/>
         </w:rPr>
         <w:t xml:space="preserve">Published: "Penerapan Metode SAW Penerima BLT Berbasis Web pada Kantor Desa Waru Jaya" - </w:t>
       </w:r>
-      <w:hyperlink w:history="1" r:id="rIdxhdq9mu93jhzwydlda_qr">
+      <w:hyperlink w:history="1" r:id="rIdpzmabsejfow3q0t4s66d_">
         <w:r>
           <w:rPr>
             <w:rStyle w:val="Hyperlink"/>
@@ -898,7 +938,7 @@
         <w:pBdr>
           <w:bottom w:val="single" w:color="1F4E79" w:sz="6" w:space="2"/>
         </w:pBdr>
-        <w:spacing w:after="18" w:before="44"/>
+        <w:spacing w:after="14" w:before="36"/>
       </w:pPr>
       <w:r>
         <w:rPr>
@@ -919,9 +959,38 @@
           <w:ilvl w:val="0"/>
           <w:numId w:val="2"/>
         </w:numPr>
-        <w:spacing w:after="6"/>
-      </w:pPr>
-      <w:hyperlink w:history="1" r:id="rIdttpiqayal5ss3efzfbu4v">
+        <w:spacing w:after="3"/>
+      </w:pPr>
+      <w:hyperlink w:history="1" r:id="rId2wsznuxy9xzq_wx966jmg">
+        <w:r>
+          <w:rPr>
+            <w:rStyle w:val="Hyperlink"/>
+            <w:rFonts w:ascii="Arial" w:cs="Arial" w:eastAsia="Arial" w:hAnsi="Arial"/>
+            <w:sz w:val="17"/>
+            <w:szCs w:val="17"/>
+          </w:rPr>
+          <w:t xml:space="preserve">CCNA: Enterprise Networking, Security &amp; Automation - Cisco Networking Academy</w:t>
+        </w:r>
+      </w:hyperlink>
+      <w:r>
+        <w:rPr>
+          <w:rFonts w:ascii="Arial" w:cs="Arial" w:eastAsia="Arial" w:hAnsi="Arial"/>
+          <w:sz w:val="17"/>
+          <w:szCs w:val="17"/>
+        </w:rPr>
+        <w:t xml:space="preserve"> - Sep 2026</w:t>
+      </w:r>
+    </w:p>
+    <w:p>
+      <w:pPr>
+        <w:pStyle w:val="ListParagraph"/>
+        <w:numPr>
+          <w:ilvl w:val="0"/>
+          <w:numId w:val="2"/>
+        </w:numPr>
+        <w:spacing w:after="3"/>
+      </w:pPr>
+      <w:hyperlink w:history="1" r:id="rIdfomit4i3kqxfznjgzk8jp">
         <w:r>
           <w:rPr>
             <w:rStyle w:val="Hyperlink"/>
@@ -948,9 +1017,9 @@
           <w:ilvl w:val="0"/>
           <w:numId w:val="2"/>
         </w:numPr>
-        <w:spacing w:after="6"/>
-      </w:pPr>
-      <w:hyperlink w:history="1" r:id="rIde_zaa-kht960ya37d85ed">
+        <w:spacing w:after="3"/>
+      </w:pPr>
+      <w:hyperlink w:history="1" r:id="rIdrjdysmfwb7vuha05mxd4s">
         <w:r>
           <w:rPr>
             <w:rStyle w:val="Hyperlink"/>
@@ -977,9 +1046,9 @@
           <w:ilvl w:val="0"/>
           <w:numId w:val="2"/>
         </w:numPr>
-        <w:spacing w:after="6"/>
-      </w:pPr>
-      <w:hyperlink w:history="1" r:id="rIdy7hsoxu5nzmfbfywxltmr">
+        <w:spacing w:after="3"/>
+      </w:pPr>
+      <w:hyperlink w:history="1" r:id="rIdq3ofeikxljmtha2olifb1">
         <w:r>
           <w:rPr>
             <w:rStyle w:val="Hyperlink"/>
@@ -1006,9 +1075,9 @@
           <w:ilvl w:val="0"/>
           <w:numId w:val="2"/>
         </w:numPr>
-        <w:spacing w:after="6"/>
-      </w:pPr>
-      <w:hyperlink w:history="1" r:id="rIdumd3viz4j5lo1acbjnhae">
+        <w:spacing w:after="3"/>
+      </w:pPr>
+      <w:hyperlink w:history="1" r:id="rId58epnkhbvyuydnvlt4guy">
         <w:r>
           <w:rPr>
             <w:rStyle w:val="Hyperlink"/>
@@ -1016,7 +1085,7 @@
             <w:sz w:val="17"/>
             <w:szCs w:val="17"/>
           </w:rPr>
-          <w:t xml:space="preserve">Fundamental Project Management - Google / Komdigi</w:t>
+          <w:t xml:space="preserve">Project Management (Google)</w:t>
         </w:r>
       </w:hyperlink>
       <w:r>
@@ -1025,19 +1094,9 @@
           <w:sz w:val="17"/>
           <w:szCs w:val="17"/>
         </w:rPr>
-        <w:t xml:space="preserve"> - 2025</w:t>
-      </w:r>
-    </w:p>
-    <w:p>
-      <w:pPr>
-        <w:pStyle w:val="ListParagraph"/>
-        <w:numPr>
-          <w:ilvl w:val="0"/>
-          <w:numId w:val="2"/>
-        </w:numPr>
-        <w:spacing w:after="6"/>
-      </w:pPr>
-      <w:hyperlink w:history="1" r:id="rId6zrlu2hpaf4aulntjghmb">
+        <w:t xml:space="preserve"> and </w:t>
+      </w:r>
+      <w:hyperlink w:history="1" r:id="rIduoxk9xm_wyt4w4821tcmv">
         <w:r>
           <w:rPr>
             <w:rStyle w:val="Hyperlink"/>
@@ -1045,7 +1104,7 @@
             <w:sz w:val="17"/>
             <w:szCs w:val="17"/>
           </w:rPr>
-          <w:t xml:space="preserve">Prompt Engineering with Azure OpenAI Service - Microsoft / Komdigi</w:t>
+          <w:t xml:space="preserve">Prompt Engineering with Azure OpenAI (Microsoft)</w:t>
         </w:r>
       </w:hyperlink>
       <w:r>
@@ -1054,19 +1113,19 @@
           <w:sz w:val="17"/>
           <w:szCs w:val="17"/>
         </w:rPr>
-        <w:t xml:space="preserve"> - 2025</w:t>
-      </w:r>
-    </w:p>
-    <w:p>
-      <w:pPr>
-        <w:pStyle w:val="ListParagraph"/>
-        <w:numPr>
-          <w:ilvl w:val="0"/>
-          <w:numId w:val="2"/>
-        </w:numPr>
-        <w:spacing w:after="6"/>
-      </w:pPr>
-      <w:hyperlink w:history="1" r:id="rIdioe90ursltaxgdyo3i-f7">
+        <w:t xml:space="preserve"> - Komdigi, 2025</w:t>
+      </w:r>
+    </w:p>
+    <w:p>
+      <w:pPr>
+        <w:pStyle w:val="ListParagraph"/>
+        <w:numPr>
+          <w:ilvl w:val="0"/>
+          <w:numId w:val="2"/>
+        </w:numPr>
+        <w:spacing w:after="3"/>
+      </w:pPr>
+      <w:hyperlink w:history="1" r:id="rIdwt771yajdkpailb-gebsg">
         <w:r>
           <w:rPr>
             <w:rStyle w:val="Hyperlink"/>
@@ -1091,7 +1150,7 @@
         <w:pBdr>
           <w:bottom w:val="single" w:color="1F4E79" w:sz="6" w:space="2"/>
         </w:pBdr>
-        <w:spacing w:after="18" w:before="44"/>
+        <w:spacing w:after="14" w:before="36"/>
       </w:pPr>
       <w:r>
         <w:rPr>
@@ -1141,34 +1200,15 @@
           <w:ilvl w:val="0"/>
           <w:numId w:val="2"/>
         </w:numPr>
-        <w:spacing w:after="6"/>
-      </w:pPr>
-      <w:r>
-        <w:rPr>
-          <w:rFonts w:ascii="Arial" w:cs="Arial" w:eastAsia="Arial" w:hAnsi="Arial"/>
-          <w:sz w:val="17"/>
-          <w:szCs w:val="17"/>
-        </w:rPr>
-        <w:t xml:space="preserve">Led a student journalism organization of 300+ members and coordinated 15+ events including technical seminars and workshops; recognized as Best Chapter President.</w:t>
-      </w:r>
-    </w:p>
-    <w:p>
-      <w:pPr>
-        <w:pBdr>
-          <w:bottom w:val="single" w:color="1F4E79" w:sz="6" w:space="2"/>
-        </w:pBdr>
-        <w:spacing w:after="18" w:before="44"/>
-      </w:pPr>
-      <w:r>
-        <w:rPr>
-          <w:rFonts w:ascii="Arial" w:cs="Arial" w:eastAsia="Arial" w:hAnsi="Arial"/>
-          <w:b/>
-          <w:bCs/>
-          <w:color w:val="1F4E79"/>
-          <w:sz w:val="20"/>
-          <w:szCs w:val="20"/>
-        </w:rPr>
-        <w:t xml:space="preserve">ADDITIONAL INFORMATION</w:t>
+        <w:spacing w:after="3"/>
+      </w:pPr>
+      <w:r>
+        <w:rPr>
+          <w:rFonts w:ascii="Arial" w:cs="Arial" w:eastAsia="Arial" w:hAnsi="Arial"/>
+          <w:sz w:val="17"/>
+          <w:szCs w:val="17"/>
+        </w:rPr>
+        <w:t xml:space="preserve">Led a 300+ member student journalism organization and coordinated 15+ events; recognized as Best Chapter President.</w:t>
       </w:r>
     </w:p>
     <w:p>
@@ -1191,7 +1231,7 @@
           <w:sz w:val="17"/>
           <w:szCs w:val="17"/>
         </w:rPr>
-        <w:t xml:space="preserve">Indonesian (Native, UKBI Madya)   |   Availability: Available now for full-time roles - local (Jakarta area) or remote/international.</w:t>
+        <w:t xml:space="preserve">Indonesian (Native, UKBI Madya), English (Conversational). Open to full-time roles, local (Jakarta area) or remote/international.</w:t>
       </w:r>
     </w:p>
     <w:sectPr>

</xml_diff>

<commit_message>
Summary diringkas: apa yang bisa dikerjakan, bukan daftar bukti (bio hero + CV)
</commit_message>
<xml_diff>
--- a/cv/CV_Fakhrul_Mukhlisin_2026.docx
+++ b/cv/CV_Fakhrul_Mukhlisin_2026.docx
@@ -52,7 +52,7 @@
         <w:spacing w:after="40"/>
         <w:jc w:val="center"/>
       </w:pPr>
-      <w:hyperlink w:history="1" r:id="rId3tcwx8hvropgkt8tjftst">
+      <w:hyperlink w:history="1" r:id="rIdlkwtzbbe9fzowvxoo2afa">
         <w:r>
           <w:rPr>
             <w:rStyle w:val="Hyperlink"/>
@@ -72,7 +72,7 @@
         </w:rPr>
         <w:t xml:space="preserve">  -  </w:t>
       </w:r>
-      <w:hyperlink w:history="1" r:id="rId4bvlwjh5xsmpuphk8tonz">
+      <w:hyperlink w:history="1" r:id="rId3xyoqmtjypvwytys1yhnm">
         <w:r>
           <w:rPr>
             <w:rStyle w:val="Hyperlink"/>
@@ -92,7 +92,7 @@
         </w:rPr>
         <w:t xml:space="preserve">  -  </w:t>
       </w:r>
-      <w:hyperlink w:history="1" r:id="rIdo8w1kpscqzxolcidb7sho">
+      <w:hyperlink w:history="1" r:id="rId7by2xdfuby9hx4txttx5x">
         <w:r>
           <w:rPr>
             <w:rStyle w:val="Hyperlink"/>
@@ -133,7 +133,7 @@
           <w:sz w:val="17"/>
           <w:szCs w:val="17"/>
         </w:rPr>
-        <w:t xml:space="preserve">Full Stack Developer who replaces manual, error-prone workflows with systems people actually use. Information Systems student at UNPAM (GPA 3.70/4.0, Semester 1-6) and Full Stack Engineer at PT Indotech Digital, with 20+ pull requests merged to a live Laravel platform; also a Data Analyst (OJT) at APIKpreneur, Bakti Pemuda Foundation. Final year project: a Laravel system replacing a casting agency's WhatsApp-and-spreadsheet workflow. Earlier: a Golang marketplace API (90.91/100) and a Vue.js e-commerce catalog (87.79/100).</w:t>
+        <w:t xml:space="preserve">Full Stack Developer (Laravel, Vue.js, Golang) who turns manual workflows into systems people actually use: production features at PT Indotech Digital, a Laravel system replacing a casting agency's WhatsApp-and-spreadsheet process, and data automation in Google Apps Script. Information Systems student at UNPAM, GPA 3.70/4.0 (Semester 1-6). Available now for full-time roles.</w:t>
       </w:r>
     </w:p>
     <w:p>
@@ -565,7 +565,7 @@
         </w:rPr>
         <w:t xml:space="preserve">Built a Marketplace REST API (Golang/Gin, MySQL, JWT) with Clean Architecture across 7 modules, including RBAC, multi-image upload, pagination, and atomic DB transactions. Score: 90.91/100. </w:t>
       </w:r>
-      <w:hyperlink w:history="1" r:id="rIdmrj_ejjjeec2n1ecdflwy">
+      <w:hyperlink w:history="1" r:id="rIddod1ijslaht0bixmiuldb">
         <w:r>
           <w:rPr>
             <w:rStyle w:val="Hyperlink"/>
@@ -623,7 +623,7 @@
         </w:rPr>
         <w:t xml:space="preserve">Built an E-Commerce Catalog (Vue.js 2) on live REST API data with 3 dynamic UI themes, a pixel-perfect Figma implementation, and CI/CD deployment. Score: 87.79/100. </w:t>
       </w:r>
-      <w:hyperlink w:history="1" r:id="rIdepgkzbkyf5sdo4ugdkah_">
+      <w:hyperlink w:history="1" r:id="rIdrtjwb0zxgin84bq2xbxbm">
         <w:r>
           <w:rPr>
             <w:rStyle w:val="Hyperlink"/>
@@ -681,7 +681,7 @@
         </w:rPr>
         <w:t xml:space="preserve">Managed 500+ student and alumni records, automated data workflows with JavaScript, and built a digital archive of 1,000+ files. Predikat: Sangat Baik. </w:t>
       </w:r>
-      <w:hyperlink w:history="1" r:id="rIdn5eii5stktnct_c5f49_d">
+      <w:hyperlink w:history="1" r:id="rIdqgfwdr2s8bnszjn5q5ac4">
         <w:r>
           <w:rPr>
             <w:rStyle w:val="Hyperlink"/>
@@ -805,7 +805,7 @@
         </w:rPr>
         <w:t xml:space="preserve">Built and deployed two live static sites on GitHub Pages with custom Node generators, covering structured data and sitemaps: </w:t>
       </w:r>
-      <w:hyperlink w:history="1" r:id="rIdnbxltdldkbcswgscqakqb">
+      <w:hyperlink w:history="1" r:id="rIdgsujd9qljjli1q47v2mse">
         <w:r>
           <w:rPr>
             <w:rStyle w:val="Hyperlink"/>
@@ -824,7 +824,7 @@
         </w:rPr>
         <w:t xml:space="preserve"> (café site) and </w:t>
       </w:r>
-      <w:hyperlink w:history="1" r:id="rIdf1k6euejceowp4iw7k4k9">
+      <w:hyperlink w:history="1" r:id="rIdilnn27s9nkiarom2p8wiu">
         <w:r>
           <w:rPr>
             <w:rStyle w:val="Hyperlink"/>
@@ -919,7 +919,7 @@
         </w:rPr>
         <w:t xml:space="preserve">Published: "Penerapan Metode SAW Penerima BLT Berbasis Web pada Kantor Desa Waru Jaya" - </w:t>
       </w:r>
-      <w:hyperlink w:history="1" r:id="rIdpzmabsejfow3q0t4s66d_">
+      <w:hyperlink w:history="1" r:id="rIdutv0wpnd1wih_y1rj7mqs">
         <w:r>
           <w:rPr>
             <w:rStyle w:val="Hyperlink"/>
@@ -961,7 +961,7 @@
         </w:numPr>
         <w:spacing w:after="3"/>
       </w:pPr>
-      <w:hyperlink w:history="1" r:id="rId2wsznuxy9xzq_wx966jmg">
+      <w:hyperlink w:history="1" r:id="rIdqfllukums853g7ocntobe">
         <w:r>
           <w:rPr>
             <w:rStyle w:val="Hyperlink"/>
@@ -990,7 +990,7 @@
         </w:numPr>
         <w:spacing w:after="3"/>
       </w:pPr>
-      <w:hyperlink w:history="1" r:id="rIdfomit4i3kqxfznjgzk8jp">
+      <w:hyperlink w:history="1" r:id="rIde-nq_feecsu2mfotsxvcq">
         <w:r>
           <w:rPr>
             <w:rStyle w:val="Hyperlink"/>
@@ -1019,7 +1019,7 @@
         </w:numPr>
         <w:spacing w:after="3"/>
       </w:pPr>
-      <w:hyperlink w:history="1" r:id="rIdrjdysmfwb7vuha05mxd4s">
+      <w:hyperlink w:history="1" r:id="rIdwszs96nnrhkys9tdv4h1u">
         <w:r>
           <w:rPr>
             <w:rStyle w:val="Hyperlink"/>
@@ -1048,7 +1048,7 @@
         </w:numPr>
         <w:spacing w:after="3"/>
       </w:pPr>
-      <w:hyperlink w:history="1" r:id="rIdq3ofeikxljmtha2olifb1">
+      <w:hyperlink w:history="1" r:id="rIdmqmhc-p8hjos9d5c1iqar">
         <w:r>
           <w:rPr>
             <w:rStyle w:val="Hyperlink"/>
@@ -1077,7 +1077,7 @@
         </w:numPr>
         <w:spacing w:after="3"/>
       </w:pPr>
-      <w:hyperlink w:history="1" r:id="rId58epnkhbvyuydnvlt4guy">
+      <w:hyperlink w:history="1" r:id="rIdfralapr8cs_lfdmrbsxer">
         <w:r>
           <w:rPr>
             <w:rStyle w:val="Hyperlink"/>
@@ -1096,7 +1096,7 @@
         </w:rPr>
         <w:t xml:space="preserve"> and </w:t>
       </w:r>
-      <w:hyperlink w:history="1" r:id="rIduoxk9xm_wyt4w4821tcmv">
+      <w:hyperlink w:history="1" r:id="rIdhdt6yf4qem5chggfx3ao1">
         <w:r>
           <w:rPr>
             <w:rStyle w:val="Hyperlink"/>
@@ -1125,7 +1125,7 @@
         </w:numPr>
         <w:spacing w:after="3"/>
       </w:pPr>
-      <w:hyperlink w:history="1" r:id="rIdwt771yajdkpailb-gebsg">
+      <w:hyperlink w:history="1" r:id="rIdosjul_cnsluqdi6oeyuim">
         <w:r>
           <w:rPr>
             <w:rStyle w:val="Hyperlink"/>

</xml_diff>

<commit_message>
CV: tanggal rata kanan sampai margin
</commit_message>
<xml_diff>
--- a/cv/CV_Fakhrul_Mukhlisin_2026.docx
+++ b/cv/CV_Fakhrul_Mukhlisin_2026.docx
@@ -52,7 +52,7 @@
         <w:spacing w:after="40"/>
         <w:jc w:val="center"/>
       </w:pPr>
-      <w:hyperlink w:history="1" r:id="rIdlkwtzbbe9fzowvxoo2afa">
+      <w:hyperlink w:history="1" r:id="rIdkalx-b2otjhdkg7rsqv-g">
         <w:r>
           <w:rPr>
             <w:rStyle w:val="Hyperlink"/>
@@ -72,7 +72,7 @@
         </w:rPr>
         <w:t xml:space="preserve">  -  </w:t>
       </w:r>
-      <w:hyperlink w:history="1" r:id="rId3xyoqmtjypvwytys1yhnm">
+      <w:hyperlink w:history="1" r:id="rIdgryu2jxs2y9_9jzcy5fjt">
         <w:r>
           <w:rPr>
             <w:rStyle w:val="Hyperlink"/>
@@ -92,7 +92,7 @@
         </w:rPr>
         <w:t xml:space="preserve">  -  </w:t>
       </w:r>
-      <w:hyperlink w:history="1" r:id="rId7by2xdfuby9hx4txttx5x">
+      <w:hyperlink w:history="1" r:id="rIdexhttaqdjwo_hhpqbaysd">
         <w:r>
           <w:rPr>
             <w:rStyle w:val="Hyperlink"/>
@@ -338,7 +338,7 @@
     <w:p>
       <w:pPr>
         <w:tabs>
-          <w:tab w:val="right" w:pos="9026"/>
+          <w:tab w:val="right" w:pos="10800"/>
         </w:tabs>
         <w:spacing w:after="4" w:before="32"/>
       </w:pPr>
@@ -421,7 +421,7 @@
     <w:p>
       <w:pPr>
         <w:tabs>
-          <w:tab w:val="right" w:pos="9026"/>
+          <w:tab w:val="right" w:pos="10800"/>
         </w:tabs>
         <w:spacing w:after="4" w:before="32"/>
       </w:pPr>
@@ -522,7 +522,7 @@
     <w:p>
       <w:pPr>
         <w:tabs>
-          <w:tab w:val="right" w:pos="9026"/>
+          <w:tab w:val="right" w:pos="10800"/>
         </w:tabs>
         <w:spacing w:after="4" w:before="32"/>
       </w:pPr>
@@ -565,7 +565,7 @@
         </w:rPr>
         <w:t xml:space="preserve">Built a Marketplace REST API (Golang/Gin, MySQL, JWT) with Clean Architecture across 7 modules, including RBAC, multi-image upload, pagination, and atomic DB transactions. Score: 90.91/100. </w:t>
       </w:r>
-      <w:hyperlink w:history="1" r:id="rIddod1ijslaht0bixmiuldb">
+      <w:hyperlink w:history="1" r:id="rIdawhig1hd9qckbeqp1zvcw">
         <w:r>
           <w:rPr>
             <w:rStyle w:val="Hyperlink"/>
@@ -580,7 +580,7 @@
     <w:p>
       <w:pPr>
         <w:tabs>
-          <w:tab w:val="right" w:pos="9026"/>
+          <w:tab w:val="right" w:pos="10800"/>
         </w:tabs>
         <w:spacing w:after="4" w:before="32"/>
       </w:pPr>
@@ -623,7 +623,7 @@
         </w:rPr>
         <w:t xml:space="preserve">Built an E-Commerce Catalog (Vue.js 2) on live REST API data with 3 dynamic UI themes, a pixel-perfect Figma implementation, and CI/CD deployment. Score: 87.79/100. </w:t>
       </w:r>
-      <w:hyperlink w:history="1" r:id="rIdrtjwb0zxgin84bq2xbxbm">
+      <w:hyperlink w:history="1" r:id="rIdunhfff3rhqzyxgix2f_js">
         <w:r>
           <w:rPr>
             <w:rStyle w:val="Hyperlink"/>
@@ -638,7 +638,7 @@
     <w:p>
       <w:pPr>
         <w:tabs>
-          <w:tab w:val="right" w:pos="9026"/>
+          <w:tab w:val="right" w:pos="10800"/>
         </w:tabs>
         <w:spacing w:after="4" w:before="32"/>
       </w:pPr>
@@ -681,7 +681,7 @@
         </w:rPr>
         <w:t xml:space="preserve">Managed 500+ student and alumni records, automated data workflows with JavaScript, and built a digital archive of 1,000+ files. Predikat: Sangat Baik. </w:t>
       </w:r>
-      <w:hyperlink w:history="1" r:id="rIdqgfwdr2s8bnszjn5q5ac4">
+      <w:hyperlink w:history="1" r:id="rIdgt4mgybsntabp_8p-z9tj">
         <w:r>
           <w:rPr>
             <w:rStyle w:val="Hyperlink"/>
@@ -715,7 +715,7 @@
     <w:p>
       <w:pPr>
         <w:tabs>
-          <w:tab w:val="right" w:pos="9026"/>
+          <w:tab w:val="right" w:pos="10800"/>
         </w:tabs>
         <w:spacing w:after="4" w:before="32"/>
       </w:pPr>
@@ -762,7 +762,7 @@
     <w:p>
       <w:pPr>
         <w:tabs>
-          <w:tab w:val="right" w:pos="9026"/>
+          <w:tab w:val="right" w:pos="10800"/>
         </w:tabs>
         <w:spacing w:after="4" w:before="32"/>
       </w:pPr>
@@ -805,7 +805,7 @@
         </w:rPr>
         <w:t xml:space="preserve">Built and deployed two live static sites on GitHub Pages with custom Node generators, covering structured data and sitemaps: </w:t>
       </w:r>
-      <w:hyperlink w:history="1" r:id="rIdgsujd9qljjli1q47v2mse">
+      <w:hyperlink w:history="1" r:id="rId29zyh7ajq5s-j7p6p9cup">
         <w:r>
           <w:rPr>
             <w:rStyle w:val="Hyperlink"/>
@@ -824,7 +824,7 @@
         </w:rPr>
         <w:t xml:space="preserve"> (café site) and </w:t>
       </w:r>
-      <w:hyperlink w:history="1" r:id="rIdilnn27s9nkiarom2p8wiu">
+      <w:hyperlink w:history="1" r:id="rId_8epmaqyrg50bt6jdqn_y">
         <w:r>
           <w:rPr>
             <w:rStyle w:val="Hyperlink"/>
@@ -866,7 +866,7 @@
     <w:p>
       <w:pPr>
         <w:tabs>
-          <w:tab w:val="right" w:pos="9026"/>
+          <w:tab w:val="right" w:pos="10800"/>
         </w:tabs>
         <w:spacing w:after="4" w:before="32"/>
       </w:pPr>
@@ -919,7 +919,7 @@
         </w:rPr>
         <w:t xml:space="preserve">Published: "Penerapan Metode SAW Penerima BLT Berbasis Web pada Kantor Desa Waru Jaya" - </w:t>
       </w:r>
-      <w:hyperlink w:history="1" r:id="rIdutv0wpnd1wih_y1rj7mqs">
+      <w:hyperlink w:history="1" r:id="rIdzbhkwjqdk4vy_4s8ya_ws">
         <w:r>
           <w:rPr>
             <w:rStyle w:val="Hyperlink"/>
@@ -961,7 +961,7 @@
         </w:numPr>
         <w:spacing w:after="3"/>
       </w:pPr>
-      <w:hyperlink w:history="1" r:id="rIdqfllukums853g7ocntobe">
+      <w:hyperlink w:history="1" r:id="rId6_zxkf7h2-w147rwyxoke">
         <w:r>
           <w:rPr>
             <w:rStyle w:val="Hyperlink"/>
@@ -990,7 +990,7 @@
         </w:numPr>
         <w:spacing w:after="3"/>
       </w:pPr>
-      <w:hyperlink w:history="1" r:id="rIde-nq_feecsu2mfotsxvcq">
+      <w:hyperlink w:history="1" r:id="rIdww8ygdjzgcxhyypg746g2">
         <w:r>
           <w:rPr>
             <w:rStyle w:val="Hyperlink"/>
@@ -1019,7 +1019,7 @@
         </w:numPr>
         <w:spacing w:after="3"/>
       </w:pPr>
-      <w:hyperlink w:history="1" r:id="rIdwszs96nnrhkys9tdv4h1u">
+      <w:hyperlink w:history="1" r:id="rIdkgeqjy-c5bw9ths8ppto6">
         <w:r>
           <w:rPr>
             <w:rStyle w:val="Hyperlink"/>
@@ -1048,7 +1048,7 @@
         </w:numPr>
         <w:spacing w:after="3"/>
       </w:pPr>
-      <w:hyperlink w:history="1" r:id="rIdmqmhc-p8hjos9d5c1iqar">
+      <w:hyperlink w:history="1" r:id="rIditle3-sbqnowaq5jpqdsd">
         <w:r>
           <w:rPr>
             <w:rStyle w:val="Hyperlink"/>
@@ -1077,7 +1077,7 @@
         </w:numPr>
         <w:spacing w:after="3"/>
       </w:pPr>
-      <w:hyperlink w:history="1" r:id="rIdfralapr8cs_lfdmrbsxer">
+      <w:hyperlink w:history="1" r:id="rIdmyr9924t_ovhfpmpxaqkb">
         <w:r>
           <w:rPr>
             <w:rStyle w:val="Hyperlink"/>
@@ -1096,7 +1096,7 @@
         </w:rPr>
         <w:t xml:space="preserve"> and </w:t>
       </w:r>
-      <w:hyperlink w:history="1" r:id="rIdhdt6yf4qem5chggfx3ao1">
+      <w:hyperlink w:history="1" r:id="rIdoh4ozxarmrxob1rrmhclb">
         <w:r>
           <w:rPr>
             <w:rStyle w:val="Hyperlink"/>
@@ -1125,7 +1125,7 @@
         </w:numPr>
         <w:spacing w:after="3"/>
       </w:pPr>
-      <w:hyperlink w:history="1" r:id="rIdosjul_cnsluqdi6oeyuim">
+      <w:hyperlink w:history="1" r:id="rId1aig7xgrxhxwdshw6f7mf">
         <w:r>
           <w:rPr>
             <w:rStyle w:val="Hyperlink"/>
@@ -1167,7 +1167,7 @@
     <w:p>
       <w:pPr>
         <w:tabs>
-          <w:tab w:val="right" w:pos="9026"/>
+          <w:tab w:val="right" w:pos="10800"/>
         </w:tabs>
         <w:spacing w:after="4" w:before="32"/>
       </w:pPr>

</xml_diff>

<commit_message>
CV: NobiPlay dicabut (izin tertulis belum ada, tetap hanya di portfolio)
</commit_message>
<xml_diff>
--- a/cv/CV_Fakhrul_Mukhlisin_2026.docx
+++ b/cv/CV_Fakhrul_Mukhlisin_2026.docx
@@ -52,7 +52,7 @@
         <w:spacing w:after="40"/>
         <w:jc w:val="center"/>
       </w:pPr>
-      <w:hyperlink w:history="1" r:id="rIdkalx-b2otjhdkg7rsqv-g">
+      <w:hyperlink w:history="1" r:id="rIdnul3sktyra1ki2wid-xxl">
         <w:r>
           <w:rPr>
             <w:rStyle w:val="Hyperlink"/>
@@ -72,7 +72,7 @@
         </w:rPr>
         <w:t xml:space="preserve">  -  </w:t>
       </w:r>
-      <w:hyperlink w:history="1" r:id="rIdgryu2jxs2y9_9jzcy5fjt">
+      <w:hyperlink w:history="1" r:id="rId1wtunwkiwtr783kmflao9">
         <w:r>
           <w:rPr>
             <w:rStyle w:val="Hyperlink"/>
@@ -92,7 +92,7 @@
         </w:rPr>
         <w:t xml:space="preserve">  -  </w:t>
       </w:r>
-      <w:hyperlink w:history="1" r:id="rIdexhttaqdjwo_hhpqbaysd">
+      <w:hyperlink w:history="1" r:id="rIdvrdqejx9txio32ws3u_1o">
         <w:r>
           <w:rPr>
             <w:rStyle w:val="Hyperlink"/>
@@ -480,24 +480,6 @@
           <w:sz w:val="17"/>
           <w:szCs w:val="17"/>
         </w:rPr>
-        <w:t xml:space="preserve">Building the live-streaming studio module for NobiPlay: role-based CMS, stream scheduling, and automated channel setup, backed by a 442-test suite.</w:t>
-      </w:r>
-    </w:p>
-    <w:p>
-      <w:pPr>
-        <w:pStyle w:val="ListParagraph"/>
-        <w:numPr>
-          <w:ilvl w:val="0"/>
-          <w:numId w:val="2"/>
-        </w:numPr>
-        <w:spacing w:after="3"/>
-      </w:pPr>
-      <w:r>
-        <w:rPr>
-          <w:rFonts w:ascii="Arial" w:cs="Arial" w:eastAsia="Arial" w:hAnsi="Arial"/>
-          <w:sz w:val="17"/>
-          <w:szCs w:val="17"/>
-        </w:rPr>
         <w:t xml:space="preserve">Built the Bootcamp module end-to-end in Laravel 11 (6-table data model, backend, admin CMS, public pages) and the Webinar module (registration, Mailable confirmations); eager-loaded Eloquent relations to avoid N+1 queries.</w:t>
       </w:r>
     </w:p>
@@ -565,7 +547,7 @@
         </w:rPr>
         <w:t xml:space="preserve">Built a Marketplace REST API (Golang/Gin, MySQL, JWT) with Clean Architecture across 7 modules, including RBAC, multi-image upload, pagination, and atomic DB transactions. Score: 90.91/100. </w:t>
       </w:r>
-      <w:hyperlink w:history="1" r:id="rIdawhig1hd9qckbeqp1zvcw">
+      <w:hyperlink w:history="1" r:id="rIdy7nl9blzqxxp-gpzpxzd0">
         <w:r>
           <w:rPr>
             <w:rStyle w:val="Hyperlink"/>
@@ -623,7 +605,7 @@
         </w:rPr>
         <w:t xml:space="preserve">Built an E-Commerce Catalog (Vue.js 2) on live REST API data with 3 dynamic UI themes, a pixel-perfect Figma implementation, and CI/CD deployment. Score: 87.79/100. </w:t>
       </w:r>
-      <w:hyperlink w:history="1" r:id="rIdunhfff3rhqzyxgix2f_js">
+      <w:hyperlink w:history="1" r:id="rIdn6wqarqbrznuqodbbhbzw">
         <w:r>
           <w:rPr>
             <w:rStyle w:val="Hyperlink"/>
@@ -681,7 +663,7 @@
         </w:rPr>
         <w:t xml:space="preserve">Managed 500+ student and alumni records, automated data workflows with JavaScript, and built a digital archive of 1,000+ files. Predikat: Sangat Baik. </w:t>
       </w:r>
-      <w:hyperlink w:history="1" r:id="rIdgt4mgybsntabp_8p-z9tj">
+      <w:hyperlink w:history="1" r:id="rIdogllkep4esv_bxaf2vokm">
         <w:r>
           <w:rPr>
             <w:rStyle w:val="Hyperlink"/>
@@ -805,7 +787,7 @@
         </w:rPr>
         <w:t xml:space="preserve">Built and deployed two live static sites on GitHub Pages with custom Node generators, covering structured data and sitemaps: </w:t>
       </w:r>
-      <w:hyperlink w:history="1" r:id="rId29zyh7ajq5s-j7p6p9cup">
+      <w:hyperlink w:history="1" r:id="rIdtuijlz3iawzrg-0cy5pqs">
         <w:r>
           <w:rPr>
             <w:rStyle w:val="Hyperlink"/>
@@ -824,7 +806,7 @@
         </w:rPr>
         <w:t xml:space="preserve"> (café site) and </w:t>
       </w:r>
-      <w:hyperlink w:history="1" r:id="rId_8epmaqyrg50bt6jdqn_y">
+      <w:hyperlink w:history="1" r:id="rIdqgzsohbhskf8gzoronawc">
         <w:r>
           <w:rPr>
             <w:rStyle w:val="Hyperlink"/>
@@ -919,7 +901,7 @@
         </w:rPr>
         <w:t xml:space="preserve">Published: "Penerapan Metode SAW Penerima BLT Berbasis Web pada Kantor Desa Waru Jaya" - </w:t>
       </w:r>
-      <w:hyperlink w:history="1" r:id="rIdzbhkwjqdk4vy_4s8ya_ws">
+      <w:hyperlink w:history="1" r:id="rIdxhufnvb0z2pg2fhib-ykg">
         <w:r>
           <w:rPr>
             <w:rStyle w:val="Hyperlink"/>
@@ -961,7 +943,7 @@
         </w:numPr>
         <w:spacing w:after="3"/>
       </w:pPr>
-      <w:hyperlink w:history="1" r:id="rId6_zxkf7h2-w147rwyxoke">
+      <w:hyperlink w:history="1" r:id="rIdi608kjmdfbqexmlnodg5s">
         <w:r>
           <w:rPr>
             <w:rStyle w:val="Hyperlink"/>
@@ -990,7 +972,7 @@
         </w:numPr>
         <w:spacing w:after="3"/>
       </w:pPr>
-      <w:hyperlink w:history="1" r:id="rIdww8ygdjzgcxhyypg746g2">
+      <w:hyperlink w:history="1" r:id="rIdsm9jyndtzi-dbfsuqcghk">
         <w:r>
           <w:rPr>
             <w:rStyle w:val="Hyperlink"/>
@@ -1019,7 +1001,7 @@
         </w:numPr>
         <w:spacing w:after="3"/>
       </w:pPr>
-      <w:hyperlink w:history="1" r:id="rIdkgeqjy-c5bw9ths8ppto6">
+      <w:hyperlink w:history="1" r:id="rIdpt5jxjv1nmpdlqlvvhj55">
         <w:r>
           <w:rPr>
             <w:rStyle w:val="Hyperlink"/>
@@ -1048,7 +1030,7 @@
         </w:numPr>
         <w:spacing w:after="3"/>
       </w:pPr>
-      <w:hyperlink w:history="1" r:id="rIditle3-sbqnowaq5jpqdsd">
+      <w:hyperlink w:history="1" r:id="rId1wuvr34hn00lpcacftxd3">
         <w:r>
           <w:rPr>
             <w:rStyle w:val="Hyperlink"/>
@@ -1077,7 +1059,7 @@
         </w:numPr>
         <w:spacing w:after="3"/>
       </w:pPr>
-      <w:hyperlink w:history="1" r:id="rIdmyr9924t_ovhfpmpxaqkb">
+      <w:hyperlink w:history="1" r:id="rId-z6oycujb0htn0_4vtih5">
         <w:r>
           <w:rPr>
             <w:rStyle w:val="Hyperlink"/>
@@ -1096,7 +1078,7 @@
         </w:rPr>
         <w:t xml:space="preserve"> and </w:t>
       </w:r>
-      <w:hyperlink w:history="1" r:id="rIdoh4ozxarmrxob1rrmhclb">
+      <w:hyperlink w:history="1" r:id="rId1i-jjzmvjmadsz4buy8hl">
         <w:r>
           <w:rPr>
             <w:rStyle w:val="Hyperlink"/>
@@ -1125,7 +1107,7 @@
         </w:numPr>
         <w:spacing w:after="3"/>
       </w:pPr>
-      <w:hyperlink w:history="1" r:id="rId1aig7xgrxhxwdshw6f7mf">
+      <w:hyperlink w:history="1" r:id="rIdna804dljnkiiqquz4ifsb">
         <w:r>
           <w:rPr>
             <w:rStyle w:val="Hyperlink"/>

</xml_diff>

<commit_message>
CV: tambah NobiPlay (modul live-streaming), regen docx+pdf, sinkron tombol Download CV
</commit_message>
<xml_diff>
--- a/cv/CV_Fakhrul_Mukhlisin_2026.docx
+++ b/cv/CV_Fakhrul_Mukhlisin_2026.docx
@@ -52,7 +52,7 @@
         <w:spacing w:after="40"/>
         <w:jc w:val="center"/>
       </w:pPr>
-      <w:hyperlink w:history="1" r:id="rIdnul3sktyra1ki2wid-xxl">
+      <w:hyperlink w:history="1" r:id="rId3lqbevi8z1i1veq0_56nb">
         <w:r>
           <w:rPr>
             <w:rStyle w:val="Hyperlink"/>
@@ -72,7 +72,7 @@
         </w:rPr>
         <w:t xml:space="preserve">  -  </w:t>
       </w:r>
-      <w:hyperlink w:history="1" r:id="rId1wtunwkiwtr783kmflao9">
+      <w:hyperlink w:history="1" r:id="rIdy3ja-gt-uwpjm1xmdkbir">
         <w:r>
           <w:rPr>
             <w:rStyle w:val="Hyperlink"/>
@@ -92,7 +92,7 @@
         </w:rPr>
         <w:t xml:space="preserve">  -  </w:t>
       </w:r>
-      <w:hyperlink w:history="1" r:id="rIdvrdqejx9txio32ws3u_1o">
+      <w:hyperlink w:history="1" r:id="rIdlbnmveh3_h0-kx7sc4mmq">
         <w:r>
           <w:rPr>
             <w:rStyle w:val="Hyperlink"/>
@@ -503,6 +503,24 @@
     </w:p>
     <w:p>
       <w:pPr>
+        <w:pStyle w:val="ListParagraph"/>
+        <w:numPr>
+          <w:ilvl w:val="0"/>
+          <w:numId w:val="2"/>
+        </w:numPr>
+        <w:spacing w:after="3"/>
+      </w:pPr>
+      <w:r>
+        <w:rPr>
+          <w:rFonts w:ascii="Arial" w:cs="Arial" w:eastAsia="Arial" w:hAnsi="Arial"/>
+          <w:sz w:val="17"/>
+          <w:szCs w:val="17"/>
+        </w:rPr>
+        <w:t xml:space="preserve">Contributor on NobiPlay, a live product: scope limited to the live-streaming module.</w:t>
+      </w:r>
+    </w:p>
+    <w:p>
+      <w:pPr>
         <w:tabs>
           <w:tab w:val="right" w:pos="10800"/>
         </w:tabs>
@@ -547,7 +565,7 @@
         </w:rPr>
         <w:t xml:space="preserve">Built a Marketplace REST API (Golang/Gin, MySQL, JWT) with Clean Architecture across 7 modules, including RBAC, multi-image upload, pagination, and atomic DB transactions. Score: 90.91/100. </w:t>
       </w:r>
-      <w:hyperlink w:history="1" r:id="rIdy7nl9blzqxxp-gpzpxzd0">
+      <w:hyperlink w:history="1" r:id="rId6gbzwn5swcwoscvgewdmk">
         <w:r>
           <w:rPr>
             <w:rStyle w:val="Hyperlink"/>
@@ -605,7 +623,7 @@
         </w:rPr>
         <w:t xml:space="preserve">Built an E-Commerce Catalog (Vue.js 2) on live REST API data with 3 dynamic UI themes, a pixel-perfect Figma implementation, and CI/CD deployment. Score: 87.79/100. </w:t>
       </w:r>
-      <w:hyperlink w:history="1" r:id="rIdn6wqarqbrznuqodbbhbzw">
+      <w:hyperlink w:history="1" r:id="rIdhqxygd8lwwh9axoum_5oi">
         <w:r>
           <w:rPr>
             <w:rStyle w:val="Hyperlink"/>
@@ -663,7 +681,7 @@
         </w:rPr>
         <w:t xml:space="preserve">Managed 500+ student and alumni records, automated data workflows with JavaScript, and built a digital archive of 1,000+ files. Predikat: Sangat Baik. </w:t>
       </w:r>
-      <w:hyperlink w:history="1" r:id="rIdogllkep4esv_bxaf2vokm">
+      <w:hyperlink w:history="1" r:id="rId7n_ctt4iwvz2n0ytojn5j">
         <w:r>
           <w:rPr>
             <w:rStyle w:val="Hyperlink"/>
@@ -787,7 +805,7 @@
         </w:rPr>
         <w:t xml:space="preserve">Built and deployed two live static sites on GitHub Pages with custom Node generators, covering structured data and sitemaps: </w:t>
       </w:r>
-      <w:hyperlink w:history="1" r:id="rIdtuijlz3iawzrg-0cy5pqs">
+      <w:hyperlink w:history="1" r:id="rIdedp_n1aouixk2t6nuihp3">
         <w:r>
           <w:rPr>
             <w:rStyle w:val="Hyperlink"/>
@@ -806,7 +824,7 @@
         </w:rPr>
         <w:t xml:space="preserve"> (café site) and </w:t>
       </w:r>
-      <w:hyperlink w:history="1" r:id="rIdqgzsohbhskf8gzoronawc">
+      <w:hyperlink w:history="1" r:id="rId0lbhqdvod5de94k6wnf8m">
         <w:r>
           <w:rPr>
             <w:rStyle w:val="Hyperlink"/>
@@ -901,7 +919,7 @@
         </w:rPr>
         <w:t xml:space="preserve">Published: "Penerapan Metode SAW Penerima BLT Berbasis Web pada Kantor Desa Waru Jaya" - </w:t>
       </w:r>
-      <w:hyperlink w:history="1" r:id="rIdxhufnvb0z2pg2fhib-ykg">
+      <w:hyperlink w:history="1" r:id="rIdl9s8fp7tr-e3vyhfggkej">
         <w:r>
           <w:rPr>
             <w:rStyle w:val="Hyperlink"/>
@@ -943,7 +961,7 @@
         </w:numPr>
         <w:spacing w:after="3"/>
       </w:pPr>
-      <w:hyperlink w:history="1" r:id="rIdi608kjmdfbqexmlnodg5s">
+      <w:hyperlink w:history="1" r:id="rIdmfhwrcgszi6d2jglyab2q">
         <w:r>
           <w:rPr>
             <w:rStyle w:val="Hyperlink"/>
@@ -972,7 +990,7 @@
         </w:numPr>
         <w:spacing w:after="3"/>
       </w:pPr>
-      <w:hyperlink w:history="1" r:id="rIdsm9jyndtzi-dbfsuqcghk">
+      <w:hyperlink w:history="1" r:id="rId57k4_aqspiqycr7dhzdlg">
         <w:r>
           <w:rPr>
             <w:rStyle w:val="Hyperlink"/>
@@ -1001,7 +1019,7 @@
         </w:numPr>
         <w:spacing w:after="3"/>
       </w:pPr>
-      <w:hyperlink w:history="1" r:id="rIdpt5jxjv1nmpdlqlvvhj55">
+      <w:hyperlink w:history="1" r:id="rIdkd1895rac7dsa-9ooax5_">
         <w:r>
           <w:rPr>
             <w:rStyle w:val="Hyperlink"/>
@@ -1030,7 +1048,7 @@
         </w:numPr>
         <w:spacing w:after="3"/>
       </w:pPr>
-      <w:hyperlink w:history="1" r:id="rId1wuvr34hn00lpcacftxd3">
+      <w:hyperlink w:history="1" r:id="rIde5c23dpl_ao-ztbynqikh">
         <w:r>
           <w:rPr>
             <w:rStyle w:val="Hyperlink"/>
@@ -1059,7 +1077,7 @@
         </w:numPr>
         <w:spacing w:after="3"/>
       </w:pPr>
-      <w:hyperlink w:history="1" r:id="rId-z6oycujb0htn0_4vtih5">
+      <w:hyperlink w:history="1" r:id="rIdgmenzg5hnhvliqbjet1js">
         <w:r>
           <w:rPr>
             <w:rStyle w:val="Hyperlink"/>
@@ -1078,7 +1096,7 @@
         </w:rPr>
         <w:t xml:space="preserve"> and </w:t>
       </w:r>
-      <w:hyperlink w:history="1" r:id="rId1i-jjzmvjmadsz4buy8hl">
+      <w:hyperlink w:history="1" r:id="rIdvy3h_0zb4ryklubvdrirx">
         <w:r>
           <w:rPr>
             <w:rStyle w:val="Hyperlink"/>
@@ -1107,7 +1125,7 @@
         </w:numPr>
         <w:spacing w:after="3"/>
       </w:pPr>
-      <w:hyperlink w:history="1" r:id="rIdna804dljnkiiqquz4ifsb">
+      <w:hyperlink w:history="1" r:id="rIdgpny4rryjbv6x0xvkraob">
         <w:r>
           <w:rPr>
             <w:rStyle w:val="Hyperlink"/>

</xml_diff>

<commit_message>
CV: urutan Experience Indotech (Full Stack) di atas, APIKpreneur di bawah
</commit_message>
<xml_diff>
--- a/cv/CV_Fakhrul_Mukhlisin_2026.docx
+++ b/cv/CV_Fakhrul_Mukhlisin_2026.docx
@@ -52,7 +52,7 @@
         <w:spacing w:after="40"/>
         <w:jc w:val="center"/>
       </w:pPr>
-      <w:hyperlink w:history="1" r:id="rId3lqbevi8z1i1veq0_56nb">
+      <w:hyperlink w:history="1" r:id="rIdn7sikjwxnrgyfyfps9_va">
         <w:r>
           <w:rPr>
             <w:rStyle w:val="Hyperlink"/>
@@ -72,7 +72,7 @@
         </w:rPr>
         <w:t xml:space="preserve">  -  </w:t>
       </w:r>
-      <w:hyperlink w:history="1" r:id="rIdy3ja-gt-uwpjm1xmdkbir">
+      <w:hyperlink w:history="1" r:id="rIdiv2dhy5ghhsn8ky-zxtwh">
         <w:r>
           <w:rPr>
             <w:rStyle w:val="Hyperlink"/>
@@ -92,7 +92,7 @@
         </w:rPr>
         <w:t xml:space="preserve">  -  </w:t>
       </w:r>
-      <w:hyperlink w:history="1" r:id="rIdlbnmveh3_h0-kx7sc4mmq">
+      <w:hyperlink w:history="1" r:id="rIdmc0c4x1huoz7ddl7ocmyx">
         <w:r>
           <w:rPr>
             <w:rStyle w:val="Hyperlink"/>
@@ -350,7 +350,7 @@
           <w:sz w:val="18"/>
           <w:szCs w:val="18"/>
         </w:rPr>
-        <w:t xml:space="preserve">Data Analyst (OJT) - APIKpreneur / Bakti Pemuda Foundation</w:t>
+        <w:t xml:space="preserve">Full Stack Engineer - PT Indotech Digital Group</w:t>
       </w:r>
       <w:r>
         <w:rPr>
@@ -361,61 +361,79 @@
           <w:sz w:val="17"/>
           <w:szCs w:val="17"/>
         </w:rPr>
-        <w:t xml:space="preserve">	Aug 2026 - Present  |  Jakarta, Hybrid</w:t>
-      </w:r>
-    </w:p>
-    <w:p>
-      <w:pPr>
-        <w:pStyle w:val="ListParagraph"/>
-        <w:numPr>
-          <w:ilvl w:val="0"/>
-          <w:numId w:val="2"/>
-        </w:numPr>
-        <w:spacing w:after="3"/>
-      </w:pPr>
-      <w:r>
-        <w:rPr>
-          <w:rFonts w:ascii="Arial" w:cs="Arial" w:eastAsia="Arial" w:hAnsi="Arial"/>
-          <w:sz w:val="17"/>
-          <w:szCs w:val="17"/>
-        </w:rPr>
-        <w:t xml:space="preserve">Placed with Gatra Data (data-analytics partner) under a scholarship-funded OJT program; built an automated donor segmentation engine in Google Apps Script for a 16,000+ row dataset, using hierarchical RFM-style logic resolved directly with stakeholders.</w:t>
-      </w:r>
-    </w:p>
-    <w:p>
-      <w:pPr>
-        <w:pStyle w:val="ListParagraph"/>
-        <w:numPr>
-          <w:ilvl w:val="0"/>
-          <w:numId w:val="2"/>
-        </w:numPr>
-        <w:spacing w:after="3"/>
-      </w:pPr>
-      <w:r>
-        <w:rPr>
-          <w:rFonts w:ascii="Arial" w:cs="Arial" w:eastAsia="Arial" w:hAnsi="Arial"/>
-          <w:sz w:val="17"/>
-          <w:szCs w:val="17"/>
-        </w:rPr>
-        <w:t xml:space="preserve">Designed a self-service dashboard - favorite-program ranking and cumulative month-over-month segment growth - for non-technical teammates.</w:t>
-      </w:r>
-    </w:p>
-    <w:p>
-      <w:pPr>
-        <w:pStyle w:val="ListParagraph"/>
-        <w:numPr>
-          <w:ilvl w:val="0"/>
-          <w:numId w:val="2"/>
-        </w:numPr>
-        <w:spacing w:after="3"/>
-      </w:pPr>
-      <w:r>
-        <w:rPr>
-          <w:rFonts w:ascii="Arial" w:cs="Arial" w:eastAsia="Arial" w:hAnsi="Arial"/>
-          <w:sz w:val="17"/>
-          <w:szCs w:val="17"/>
-        </w:rPr>
-        <w:t xml:space="preserve">Automated the full pipeline with a daily time-driven trigger, including debugging a getUi() execution-context error.</w:t>
+        <w:t xml:space="preserve">	Jun 2026 - Present  |  Jakarta, Hybrid</w:t>
+      </w:r>
+    </w:p>
+    <w:p>
+      <w:pPr>
+        <w:pStyle w:val="ListParagraph"/>
+        <w:numPr>
+          <w:ilvl w:val="0"/>
+          <w:numId w:val="2"/>
+        </w:numPr>
+        <w:spacing w:after="3"/>
+      </w:pPr>
+      <w:r>
+        <w:rPr>
+          <w:rFonts w:ascii="Arial" w:cs="Arial" w:eastAsia="Arial" w:hAnsi="Arial"/>
+          <w:sz w:val="17"/>
+          <w:szCs w:val="17"/>
+        </w:rPr>
+        <w:t xml:space="preserve">Ship features to Nobel Akademi, a live Learning Management System - 20+ pull requests merged to production through a dev to staging to main review flow.</w:t>
+      </w:r>
+    </w:p>
+    <w:p>
+      <w:pPr>
+        <w:pStyle w:val="ListParagraph"/>
+        <w:numPr>
+          <w:ilvl w:val="0"/>
+          <w:numId w:val="2"/>
+        </w:numPr>
+        <w:spacing w:after="3"/>
+      </w:pPr>
+      <w:r>
+        <w:rPr>
+          <w:rFonts w:ascii="Arial" w:cs="Arial" w:eastAsia="Arial" w:hAnsi="Arial"/>
+          <w:sz w:val="17"/>
+          <w:szCs w:val="17"/>
+        </w:rPr>
+        <w:t xml:space="preserve">Built the Bootcamp module end-to-end in Laravel 11 (6-table data model, backend, admin CMS, public pages) and the Webinar module (registration, Mailable confirmations); eager-loaded Eloquent relations to avoid N+1 queries.</w:t>
+      </w:r>
+    </w:p>
+    <w:p>
+      <w:pPr>
+        <w:pStyle w:val="ListParagraph"/>
+        <w:numPr>
+          <w:ilvl w:val="0"/>
+          <w:numId w:val="2"/>
+        </w:numPr>
+        <w:spacing w:after="3"/>
+      </w:pPr>
+      <w:r>
+        <w:rPr>
+          <w:rFonts w:ascii="Arial" w:cs="Arial" w:eastAsia="Arial" w:hAnsi="Arial"/>
+          <w:sz w:val="17"/>
+          <w:szCs w:val="17"/>
+        </w:rPr>
+        <w:t xml:space="preserve">Traced a production defect to its root cause (a corrupted vendor asset silently halting JavaScript) and hardened the page so one failing library cannot break unrelated features.</w:t>
+      </w:r>
+    </w:p>
+    <w:p>
+      <w:pPr>
+        <w:pStyle w:val="ListParagraph"/>
+        <w:numPr>
+          <w:ilvl w:val="0"/>
+          <w:numId w:val="2"/>
+        </w:numPr>
+        <w:spacing w:after="3"/>
+      </w:pPr>
+      <w:r>
+        <w:rPr>
+          <w:rFonts w:ascii="Arial" w:cs="Arial" w:eastAsia="Arial" w:hAnsi="Arial"/>
+          <w:sz w:val="17"/>
+          <w:szCs w:val="17"/>
+        </w:rPr>
+        <w:t xml:space="preserve">Contributor on NobiPlay, a live product: scope limited to the live-streaming module.</w:t>
       </w:r>
     </w:p>
     <w:p>
@@ -433,7 +451,7 @@
           <w:sz w:val="18"/>
           <w:szCs w:val="18"/>
         </w:rPr>
-        <w:t xml:space="preserve">Full Stack Engineer - PT Indotech Digital Group</w:t>
+        <w:t xml:space="preserve">Data Analyst (OJT) - APIKpreneur / Bakti Pemuda Foundation</w:t>
       </w:r>
       <w:r>
         <w:rPr>
@@ -444,79 +462,61 @@
           <w:sz w:val="17"/>
           <w:szCs w:val="17"/>
         </w:rPr>
-        <w:t xml:space="preserve">	Jun 2026 - Present  |  Jakarta, Hybrid</w:t>
-      </w:r>
-    </w:p>
-    <w:p>
-      <w:pPr>
-        <w:pStyle w:val="ListParagraph"/>
-        <w:numPr>
-          <w:ilvl w:val="0"/>
-          <w:numId w:val="2"/>
-        </w:numPr>
-        <w:spacing w:after="3"/>
-      </w:pPr>
-      <w:r>
-        <w:rPr>
-          <w:rFonts w:ascii="Arial" w:cs="Arial" w:eastAsia="Arial" w:hAnsi="Arial"/>
-          <w:sz w:val="17"/>
-          <w:szCs w:val="17"/>
-        </w:rPr>
-        <w:t xml:space="preserve">Ship features to Nobel Akademi, a live Learning Management System - 20+ pull requests merged to production through a dev to staging to main review flow.</w:t>
-      </w:r>
-    </w:p>
-    <w:p>
-      <w:pPr>
-        <w:pStyle w:val="ListParagraph"/>
-        <w:numPr>
-          <w:ilvl w:val="0"/>
-          <w:numId w:val="2"/>
-        </w:numPr>
-        <w:spacing w:after="3"/>
-      </w:pPr>
-      <w:r>
-        <w:rPr>
-          <w:rFonts w:ascii="Arial" w:cs="Arial" w:eastAsia="Arial" w:hAnsi="Arial"/>
-          <w:sz w:val="17"/>
-          <w:szCs w:val="17"/>
-        </w:rPr>
-        <w:t xml:space="preserve">Built the Bootcamp module end-to-end in Laravel 11 (6-table data model, backend, admin CMS, public pages) and the Webinar module (registration, Mailable confirmations); eager-loaded Eloquent relations to avoid N+1 queries.</w:t>
-      </w:r>
-    </w:p>
-    <w:p>
-      <w:pPr>
-        <w:pStyle w:val="ListParagraph"/>
-        <w:numPr>
-          <w:ilvl w:val="0"/>
-          <w:numId w:val="2"/>
-        </w:numPr>
-        <w:spacing w:after="3"/>
-      </w:pPr>
-      <w:r>
-        <w:rPr>
-          <w:rFonts w:ascii="Arial" w:cs="Arial" w:eastAsia="Arial" w:hAnsi="Arial"/>
-          <w:sz w:val="17"/>
-          <w:szCs w:val="17"/>
-        </w:rPr>
-        <w:t xml:space="preserve">Traced a production defect to its root cause (a corrupted vendor asset silently halting JavaScript) and hardened the page so one failing library cannot break unrelated features.</w:t>
-      </w:r>
-    </w:p>
-    <w:p>
-      <w:pPr>
-        <w:pStyle w:val="ListParagraph"/>
-        <w:numPr>
-          <w:ilvl w:val="0"/>
-          <w:numId w:val="2"/>
-        </w:numPr>
-        <w:spacing w:after="3"/>
-      </w:pPr>
-      <w:r>
-        <w:rPr>
-          <w:rFonts w:ascii="Arial" w:cs="Arial" w:eastAsia="Arial" w:hAnsi="Arial"/>
-          <w:sz w:val="17"/>
-          <w:szCs w:val="17"/>
-        </w:rPr>
-        <w:t xml:space="preserve">Contributor on NobiPlay, a live product: scope limited to the live-streaming module.</w:t>
+        <w:t xml:space="preserve">	Aug 2026 - Present  |  Jakarta, Hybrid</w:t>
+      </w:r>
+    </w:p>
+    <w:p>
+      <w:pPr>
+        <w:pStyle w:val="ListParagraph"/>
+        <w:numPr>
+          <w:ilvl w:val="0"/>
+          <w:numId w:val="2"/>
+        </w:numPr>
+        <w:spacing w:after="3"/>
+      </w:pPr>
+      <w:r>
+        <w:rPr>
+          <w:rFonts w:ascii="Arial" w:cs="Arial" w:eastAsia="Arial" w:hAnsi="Arial"/>
+          <w:sz w:val="17"/>
+          <w:szCs w:val="17"/>
+        </w:rPr>
+        <w:t xml:space="preserve">Placed with Gatra Data (data-analytics partner) under a scholarship-funded OJT program; built an automated donor segmentation engine in Google Apps Script for a 16,000+ row dataset, using hierarchical RFM-style logic resolved directly with stakeholders.</w:t>
+      </w:r>
+    </w:p>
+    <w:p>
+      <w:pPr>
+        <w:pStyle w:val="ListParagraph"/>
+        <w:numPr>
+          <w:ilvl w:val="0"/>
+          <w:numId w:val="2"/>
+        </w:numPr>
+        <w:spacing w:after="3"/>
+      </w:pPr>
+      <w:r>
+        <w:rPr>
+          <w:rFonts w:ascii="Arial" w:cs="Arial" w:eastAsia="Arial" w:hAnsi="Arial"/>
+          <w:sz w:val="17"/>
+          <w:szCs w:val="17"/>
+        </w:rPr>
+        <w:t xml:space="preserve">Designed a self-service dashboard - favorite-program ranking and cumulative month-over-month segment growth - for non-technical teammates.</w:t>
+      </w:r>
+    </w:p>
+    <w:p>
+      <w:pPr>
+        <w:pStyle w:val="ListParagraph"/>
+        <w:numPr>
+          <w:ilvl w:val="0"/>
+          <w:numId w:val="2"/>
+        </w:numPr>
+        <w:spacing w:after="3"/>
+      </w:pPr>
+      <w:r>
+        <w:rPr>
+          <w:rFonts w:ascii="Arial" w:cs="Arial" w:eastAsia="Arial" w:hAnsi="Arial"/>
+          <w:sz w:val="17"/>
+          <w:szCs w:val="17"/>
+        </w:rPr>
+        <w:t xml:space="preserve">Automated the full pipeline with a daily time-driven trigger, including debugging a getUi() execution-context error.</w:t>
       </w:r>
     </w:p>
     <w:p>
@@ -565,7 +565,7 @@
         </w:rPr>
         <w:t xml:space="preserve">Built a Marketplace REST API (Golang/Gin, MySQL, JWT) with Clean Architecture across 7 modules, including RBAC, multi-image upload, pagination, and atomic DB transactions. Score: 90.91/100. </w:t>
       </w:r>
-      <w:hyperlink w:history="1" r:id="rId6gbzwn5swcwoscvgewdmk">
+      <w:hyperlink w:history="1" r:id="rIdtxamu_bel5hfp-ucm8k9r">
         <w:r>
           <w:rPr>
             <w:rStyle w:val="Hyperlink"/>
@@ -623,7 +623,7 @@
         </w:rPr>
         <w:t xml:space="preserve">Built an E-Commerce Catalog (Vue.js 2) on live REST API data with 3 dynamic UI themes, a pixel-perfect Figma implementation, and CI/CD deployment. Score: 87.79/100. </w:t>
       </w:r>
-      <w:hyperlink w:history="1" r:id="rIdhqxygd8lwwh9axoum_5oi">
+      <w:hyperlink w:history="1" r:id="rId0v1swrtybtcdrkgxwv_o-">
         <w:r>
           <w:rPr>
             <w:rStyle w:val="Hyperlink"/>
@@ -681,7 +681,7 @@
         </w:rPr>
         <w:t xml:space="preserve">Managed 500+ student and alumni records, automated data workflows with JavaScript, and built a digital archive of 1,000+ files. Predikat: Sangat Baik. </w:t>
       </w:r>
-      <w:hyperlink w:history="1" r:id="rId7n_ctt4iwvz2n0ytojn5j">
+      <w:hyperlink w:history="1" r:id="rIdjznbhsvjeswrfdej6speq">
         <w:r>
           <w:rPr>
             <w:rStyle w:val="Hyperlink"/>
@@ -805,7 +805,7 @@
         </w:rPr>
         <w:t xml:space="preserve">Built and deployed two live static sites on GitHub Pages with custom Node generators, covering structured data and sitemaps: </w:t>
       </w:r>
-      <w:hyperlink w:history="1" r:id="rIdedp_n1aouixk2t6nuihp3">
+      <w:hyperlink w:history="1" r:id="rIdvuf0cu2_ns7ny1kahnxtp">
         <w:r>
           <w:rPr>
             <w:rStyle w:val="Hyperlink"/>
@@ -824,7 +824,7 @@
         </w:rPr>
         <w:t xml:space="preserve"> (café site) and </w:t>
       </w:r>
-      <w:hyperlink w:history="1" r:id="rId0lbhqdvod5de94k6wnf8m">
+      <w:hyperlink w:history="1" r:id="rId4e9p3hovzmuiniwuntqyk">
         <w:r>
           <w:rPr>
             <w:rStyle w:val="Hyperlink"/>
@@ -919,7 +919,7 @@
         </w:rPr>
         <w:t xml:space="preserve">Published: "Penerapan Metode SAW Penerima BLT Berbasis Web pada Kantor Desa Waru Jaya" - </w:t>
       </w:r>
-      <w:hyperlink w:history="1" r:id="rIdl9s8fp7tr-e3vyhfggkej">
+      <w:hyperlink w:history="1" r:id="rIduzawje2ekzlg8jr9dfrw3">
         <w:r>
           <w:rPr>
             <w:rStyle w:val="Hyperlink"/>
@@ -961,7 +961,7 @@
         </w:numPr>
         <w:spacing w:after="3"/>
       </w:pPr>
-      <w:hyperlink w:history="1" r:id="rIdmfhwrcgszi6d2jglyab2q">
+      <w:hyperlink w:history="1" r:id="rIduugs31v9o5dz31flqokdh">
         <w:r>
           <w:rPr>
             <w:rStyle w:val="Hyperlink"/>
@@ -990,7 +990,7 @@
         </w:numPr>
         <w:spacing w:after="3"/>
       </w:pPr>
-      <w:hyperlink w:history="1" r:id="rId57k4_aqspiqycr7dhzdlg">
+      <w:hyperlink w:history="1" r:id="rIdyqi8vlifocvdo-pt8k3ve">
         <w:r>
           <w:rPr>
             <w:rStyle w:val="Hyperlink"/>
@@ -1019,7 +1019,7 @@
         </w:numPr>
         <w:spacing w:after="3"/>
       </w:pPr>
-      <w:hyperlink w:history="1" r:id="rIdkd1895rac7dsa-9ooax5_">
+      <w:hyperlink w:history="1" r:id="rIdqdxyh20z1k-eorw9920xv">
         <w:r>
           <w:rPr>
             <w:rStyle w:val="Hyperlink"/>
@@ -1048,7 +1048,7 @@
         </w:numPr>
         <w:spacing w:after="3"/>
       </w:pPr>
-      <w:hyperlink w:history="1" r:id="rIde5c23dpl_ao-ztbynqikh">
+      <w:hyperlink w:history="1" r:id="rIdhknm2_60sr-xhbioxju2i">
         <w:r>
           <w:rPr>
             <w:rStyle w:val="Hyperlink"/>
@@ -1077,7 +1077,7 @@
         </w:numPr>
         <w:spacing w:after="3"/>
       </w:pPr>
-      <w:hyperlink w:history="1" r:id="rIdgmenzg5hnhvliqbjet1js">
+      <w:hyperlink w:history="1" r:id="rIdinfoonbqxt-n5plwkgqpz">
         <w:r>
           <w:rPr>
             <w:rStyle w:val="Hyperlink"/>
@@ -1096,7 +1096,7 @@
         </w:rPr>
         <w:t xml:space="preserve"> and </w:t>
       </w:r>
-      <w:hyperlink w:history="1" r:id="rIdvy3h_0zb4ryklubvdrirx">
+      <w:hyperlink w:history="1" r:id="rIdinrlizeu8449uetmpshy6">
         <w:r>
           <w:rPr>
             <w:rStyle w:val="Hyperlink"/>
@@ -1125,7 +1125,7 @@
         </w:numPr>
         <w:spacing w:after="3"/>
       </w:pPr>
-      <w:hyperlink w:history="1" r:id="rIdgpny4rryjbv6x0xvkraob">
+      <w:hyperlink w:history="1" r:id="rIda8brarxu_k7amtc2v78dr">
         <w:r>
           <w:rPr>
             <w:rStyle w:val="Hyperlink"/>

</xml_diff>